<commit_message>
Update contract DOCX templates
</commit_message>
<xml_diff>
--- a/schet_dogovor_template.docx
+++ b/schet_dogovor_template.docx
@@ -12,178 +12,9 @@
       </w:pPr>
       <w:r>
         <w:rPr>
-          <w:b/>
-          <w:sz w:val="20"/>
-        </w:rPr>
-        <w:t>Счет-договор</w:t>
-      </w:r>
-      <w:r>
-        <w:rPr>
-          <w:b/>
-          <w:spacing w:val="-7"/>
-          <w:sz w:val="20"/>
-        </w:rPr>
-        <w:t xml:space="preserve"> </w:t>
-      </w:r>
-      <w:r>
-        <w:rPr>
-          <w:b/>
-          <w:sz w:val="20"/>
-        </w:rPr>
-        <w:t>на</w:t>
-      </w:r>
-      <w:r>
-        <w:rPr>
-          <w:b/>
-          <w:spacing w:val="-5"/>
-          <w:sz w:val="20"/>
-        </w:rPr>
-        <w:t xml:space="preserve"> </w:t>
-      </w:r>
-      <w:r>
-        <w:rPr>
-          <w:b/>
-          <w:sz w:val="20"/>
-        </w:rPr>
-        <w:t>выполнение</w:t>
-      </w:r>
-      <w:r>
-        <w:rPr>
-          <w:b/>
-          <w:spacing w:val="-5"/>
-          <w:sz w:val="20"/>
-        </w:rPr>
-        <w:t xml:space="preserve"> </w:t>
-      </w:r>
-      <w:r>
-        <w:rPr>
-          <w:b/>
-          <w:sz w:val="20"/>
-        </w:rPr>
-        <w:t>работ</w:t>
-      </w:r>
-      <w:r>
-        <w:rPr>
-          <w:b/>
-          <w:spacing w:val="-5"/>
-          <w:sz w:val="20"/>
-        </w:rPr>
-        <w:t xml:space="preserve"> </w:t>
-      </w:r>
-      <w:r>
-        <w:rPr>
-          <w:b/>
-          <w:sz w:val="20"/>
-        </w:rPr>
-        <w:t>и/или</w:t>
-      </w:r>
-      <w:r>
-        <w:rPr>
-          <w:b/>
-          <w:spacing w:val="-5"/>
-          <w:sz w:val="20"/>
-        </w:rPr>
-        <w:t xml:space="preserve"> </w:t>
-      </w:r>
-      <w:r>
-        <w:rPr>
-          <w:b/>
-          <w:sz w:val="20"/>
-        </w:rPr>
-        <w:t>услуг</w:t>
-      </w:r>
-      <w:r>
-        <w:rPr>
-          <w:b/>
-          <w:spacing w:val="-5"/>
-          <w:sz w:val="20"/>
-        </w:rPr>
-        <w:t xml:space="preserve"> </w:t>
-      </w:r>
-      <w:r>
-        <w:rPr>
-          <w:sz w:val="20"/>
-        </w:rPr>
-        <w:t>№</w:t>
-      </w:r>
-      <w:r>
-        <w:rPr>
-          <w:spacing w:val="-5"/>
-          <w:sz w:val="20"/>
-        </w:rPr>
-        <w:t xml:space="preserve"> </w:t>
-      </w:r>
-      <w:r>
-        <w:rPr>
-          <w:sz w:val="20"/>
-        </w:rPr>
-        <w:t>6911</w:t>
-      </w:r>
-      <w:r>
-        <w:rPr>
-          <w:spacing w:val="-5"/>
-          <w:sz w:val="20"/>
-        </w:rPr>
-        <w:t xml:space="preserve"> </w:t>
-      </w:r>
-      <w:r>
-        <w:rPr>
-          <w:sz w:val="20"/>
-        </w:rPr>
-        <w:t>от</w:t>
-      </w:r>
-      <w:r>
-        <w:rPr>
-          <w:spacing w:val="-5"/>
-          <w:sz w:val="20"/>
-        </w:rPr>
-        <w:t xml:space="preserve"> </w:t>
-      </w:r>
-      <w:r>
-        <w:rPr>
-          <w:sz w:val="20"/>
-        </w:rPr>
-        <w:t>13</w:t>
-      </w:r>
-      <w:r>
-        <w:rPr>
-          <w:spacing w:val="-5"/>
-          <w:sz w:val="20"/>
-        </w:rPr>
-        <w:t xml:space="preserve"> </w:t>
-      </w:r>
-      <w:r>
-        <w:rPr>
-          <w:sz w:val="20"/>
-        </w:rPr>
-        <w:t>мая</w:t>
-      </w:r>
-      <w:r>
-        <w:rPr>
-          <w:spacing w:val="-5"/>
-          <w:sz w:val="20"/>
-        </w:rPr>
-        <w:t xml:space="preserve"> </w:t>
-      </w:r>
-      <w:r>
-        <w:rPr>
-          <w:sz w:val="20"/>
-        </w:rPr>
-        <w:t>2026</w:t>
-      </w:r>
-      <w:r>
-        <w:rPr>
-          <w:spacing w:val="-4"/>
-          <w:sz w:val="20"/>
-        </w:rPr>
-        <w:t xml:space="preserve"> </w:t>
-      </w:r>
-      <w:r>
-        <w:rPr>
-          <w:spacing w:val="-5"/>
-          <w:sz w:val="20"/>
-        </w:rPr>
-        <w:t>г.</w:t>
+          <w:sz w:val="20"/>
+        </w:rPr>
+        <w:t>Счет-договор на выполнение работ и/или услуг № 16530 от 4 июнь 2026 г.</w:t>
       </w:r>
     </w:p>
     <w:p>
@@ -196,119 +27,7 @@
         <w:rPr>
           <w:b/>
         </w:rPr>
-        <w:t>Исполнитель:</w:t>
-      </w:r>
-      <w:r>
-        <w:rPr>
-          <w:b/>
-          <w:spacing w:val="-10"/>
-        </w:rPr>
-        <w:t xml:space="preserve"> </w:t>
-      </w:r>
-      <w:r>
-        <w:t>ИП</w:t>
-      </w:r>
-      <w:r>
-        <w:rPr>
-          <w:spacing w:val="-8"/>
-        </w:rPr>
-        <w:t xml:space="preserve"> </w:t>
-      </w:r>
-      <w:r>
-        <w:t>Купорова</w:t>
-      </w:r>
-      <w:r>
-        <w:rPr>
-          <w:spacing w:val="-9"/>
-        </w:rPr>
-        <w:t xml:space="preserve"> </w:t>
-      </w:r>
-      <w:r>
-        <w:t>Е.А.</w:t>
-      </w:r>
-      <w:r>
-        <w:rPr>
-          <w:spacing w:val="-7"/>
-        </w:rPr>
-        <w:t xml:space="preserve"> </w:t>
-      </w:r>
-      <w:r>
-        <w:t>(ИНН:</w:t>
-      </w:r>
-      <w:r>
-        <w:rPr>
-          <w:spacing w:val="-8"/>
-        </w:rPr>
-        <w:t xml:space="preserve"> </w:t>
-      </w:r>
-      <w:r>
-        <w:t>500805209810</w:t>
-      </w:r>
-      <w:r>
-        <w:rPr>
-          <w:spacing w:val="-7"/>
-        </w:rPr>
-        <w:t xml:space="preserve"> </w:t>
-      </w:r>
-      <w:r>
-        <w:t>/</w:t>
-      </w:r>
-      <w:r>
-        <w:rPr>
-          <w:spacing w:val="-8"/>
-        </w:rPr>
-        <w:t xml:space="preserve"> </w:t>
-      </w:r>
-      <w:r>
-        <w:t>ОГРНИП:</w:t>
-      </w:r>
-      <w:r>
-        <w:rPr>
-          <w:spacing w:val="-7"/>
-        </w:rPr>
-        <w:t xml:space="preserve"> </w:t>
-      </w:r>
-      <w:r>
-        <w:t>320508100357479</w:t>
-      </w:r>
-      <w:r>
-        <w:rPr>
-          <w:spacing w:val="-8"/>
-        </w:rPr>
-        <w:t xml:space="preserve"> </w:t>
-      </w:r>
-      <w:r>
-        <w:t>/</w:t>
-      </w:r>
-      <w:r>
-        <w:rPr>
-          <w:spacing w:val="-7"/>
-        </w:rPr>
-        <w:t xml:space="preserve"> </w:t>
-      </w:r>
-      <w:r>
-        <w:t>143930</w:t>
-      </w:r>
-      <w:r>
-        <w:rPr>
-          <w:spacing w:val="-8"/>
-        </w:rPr>
-        <w:t xml:space="preserve"> </w:t>
-      </w:r>
-      <w:r>
-        <w:t>МО,</w:t>
-      </w:r>
-      <w:r>
-        <w:rPr>
-          <w:spacing w:val="-7"/>
-        </w:rPr>
-        <w:t xml:space="preserve"> </w:t>
-      </w:r>
-      <w:r>
-        <w:rPr>
-          <w:spacing w:val="-5"/>
-        </w:rPr>
-        <w:t>г.</w:t>
+        <w:t>Исполнитель: ООО "ВЕРКУП" (ИНН: 9718284789 / ОГРН: 1257700358475 / 107065, РОССИЯ, г МОСКВА, ул КУРГАНСКАЯ, ДОМ 3А, корпус строение 1, оф ПОМЕЩ. 1/1)</w:t>
       </w:r>
     </w:p>
     <w:p>
@@ -317,44 +36,6 @@
         <w:spacing w:before="34"/>
         <w:ind w:left="400"/>
       </w:pPr>
-      <w:r>
-        <w:t>Балашиха,</w:t>
-      </w:r>
-      <w:r>
-        <w:rPr>
-          <w:spacing w:val="-8"/>
-        </w:rPr>
-        <w:t xml:space="preserve"> </w:t>
-      </w:r>
-      <w:r>
-        <w:t>Мирской</w:t>
-      </w:r>
-      <w:r>
-        <w:rPr>
-          <w:spacing w:val="-8"/>
-        </w:rPr>
-        <w:t xml:space="preserve"> </w:t>
-      </w:r>
-      <w:proofErr w:type="spellStart"/>
-      <w:r>
-        <w:t>пр</w:t>
-      </w:r>
-      <w:proofErr w:type="spellEnd"/>
-      <w:r>
-        <w:t>-д,</w:t>
-      </w:r>
-      <w:r>
-        <w:rPr>
-          <w:spacing w:val="-7"/>
-        </w:rPr>
-        <w:t xml:space="preserve"> </w:t>
-      </w:r>
-      <w:r>
-        <w:rPr>
-          <w:spacing w:val="-5"/>
-        </w:rPr>
-        <w:t>9)</w:t>
-      </w:r>
     </w:p>
     <w:p>
       <w:pPr>
@@ -471,7 +152,6 @@
             <w:r>
               <w:rPr>
                 <w:b/>
-                <w:spacing w:val="-5"/>
                 <w:sz w:val="20"/>
               </w:rPr>
               <w:t>ИНН</w:t>
@@ -480,17 +160,19 @@
           <w:p>
             <w:pPr>
               <w:pStyle w:val="TableParagraph"/>
+              <w:spacing w:before="101"/>
               <w:ind w:left="100"/>
               <w:rPr>
+                <w:b/>
                 <w:sz w:val="20"/>
               </w:rPr>
             </w:pPr>
             <w:r>
               <w:rPr>
-                <w:spacing w:val="-2"/>
-                <w:sz w:val="20"/>
-              </w:rPr>
-              <w:t>500805209810</w:t>
+                <w:b/>
+                <w:sz w:val="20"/>
+              </w:rPr>
+              <w:t>9718284789</w:t>
             </w:r>
           </w:p>
         </w:tc>
@@ -511,10 +193,27 @@
             <w:r>
               <w:rPr>
                 <w:b/>
-                <w:spacing w:val="-5"/>
                 <w:sz w:val="20"/>
               </w:rPr>
               <w:t>КПП</w:t>
+            </w:r>
+          </w:p>
+          <w:p>
+            <w:pPr>
+              <w:pStyle w:val="TableParagraph"/>
+              <w:spacing w:before="101"/>
+              <w:ind w:left="100"/>
+              <w:rPr>
+                <w:b/>
+                <w:sz w:val="20"/>
+              </w:rPr>
+            </w:pPr>
+            <w:r>
+              <w:rPr>
+                <w:b/>
+                <w:sz w:val="20"/>
+              </w:rPr>
+              <w:t>771801001</w:t>
             </w:r>
           </w:p>
         </w:tc>
@@ -533,23 +232,12 @@
                 <w:sz w:val="20"/>
               </w:rPr>
             </w:pPr>
-            <w:proofErr w:type="spellStart"/>
             <w:r>
               <w:rPr>
                 <w:b/>
-                <w:spacing w:val="-4"/>
-                <w:sz w:val="20"/>
-              </w:rPr>
-              <w:t>Сч</w:t>
-            </w:r>
-            <w:proofErr w:type="spellEnd"/>
-            <w:r>
-              <w:rPr>
-                <w:b/>
-                <w:spacing w:val="-4"/>
-                <w:sz w:val="20"/>
-              </w:rPr>
-              <w:t>.№</w:t>
+                <w:sz w:val="20"/>
+              </w:rPr>
+              <w:t>Сч.№</w:t>
             </w:r>
           </w:p>
         </w:tc>
@@ -571,21 +259,7 @@
               <w:rPr>
                 <w:sz w:val="20"/>
               </w:rPr>
-              <w:t>р/с:</w:t>
-            </w:r>
-            <w:r>
-              <w:rPr>
-                <w:spacing w:val="-4"/>
-                <w:sz w:val="20"/>
-              </w:rPr>
-              <w:t xml:space="preserve"> </w:t>
-            </w:r>
-            <w:r>
-              <w:rPr>
-                <w:spacing w:val="-2"/>
-                <w:sz w:val="20"/>
-              </w:rPr>
-              <w:t>40802810320000702819</w:t>
+              <w:t>р/с: 40702810920000232070</w:t>
             </w:r>
           </w:p>
         </w:tc>
@@ -610,37 +284,9 @@
             </w:pPr>
             <w:r>
               <w:rPr>
-                <w:b/>
-                <w:sz w:val="20"/>
-              </w:rPr>
-              <w:t>Получатель:</w:t>
-            </w:r>
-            <w:r>
-              <w:rPr>
-                <w:b/>
-                <w:spacing w:val="-13"/>
-                <w:sz w:val="20"/>
-              </w:rPr>
-              <w:t xml:space="preserve"> </w:t>
-            </w:r>
-            <w:r>
-              <w:rPr>
-                <w:sz w:val="20"/>
-              </w:rPr>
-              <w:t>Индивидуальный</w:t>
-            </w:r>
-            <w:r>
-              <w:rPr>
-                <w:spacing w:val="-12"/>
-                <w:sz w:val="20"/>
-              </w:rPr>
-              <w:t xml:space="preserve"> </w:t>
-            </w:r>
-            <w:r>
-              <w:rPr>
-                <w:sz w:val="20"/>
-              </w:rPr>
-              <w:t>предприниматель Купорова Евгения Александровна</w:t>
+                <w:sz w:val="20"/>
+              </w:rPr>
+              <w:t>Получатель: ООО "ВЕРКУП"</w:t>
             </w:r>
           </w:p>
         </w:tc>
@@ -700,66 +346,9 @@
             </w:pPr>
             <w:r>
               <w:rPr>
-                <w:b/>
-                <w:sz w:val="20"/>
-              </w:rPr>
-              <w:t>Банк</w:t>
-            </w:r>
-            <w:r>
-              <w:rPr>
-                <w:b/>
-                <w:spacing w:val="-9"/>
-                <w:sz w:val="20"/>
-              </w:rPr>
-              <w:t xml:space="preserve"> </w:t>
-            </w:r>
-            <w:r>
-              <w:rPr>
-                <w:b/>
-                <w:sz w:val="20"/>
-              </w:rPr>
-              <w:t>получателя:</w:t>
-            </w:r>
-            <w:r>
-              <w:rPr>
-                <w:b/>
-                <w:spacing w:val="-7"/>
-                <w:sz w:val="20"/>
-              </w:rPr>
-              <w:t xml:space="preserve"> </w:t>
-            </w:r>
-            <w:r>
-              <w:rPr>
-                <w:sz w:val="20"/>
-              </w:rPr>
-              <w:t>ООО</w:t>
-            </w:r>
-            <w:r>
-              <w:rPr>
-                <w:spacing w:val="-7"/>
-                <w:sz w:val="20"/>
-              </w:rPr>
-              <w:t xml:space="preserve"> </w:t>
-            </w:r>
-            <w:r>
-              <w:rPr>
-                <w:sz w:val="20"/>
-              </w:rPr>
-              <w:t>"Банк</w:t>
-            </w:r>
-            <w:r>
-              <w:rPr>
-                <w:spacing w:val="-6"/>
-                <w:sz w:val="20"/>
-              </w:rPr>
-              <w:t xml:space="preserve"> </w:t>
-            </w:r>
-            <w:r>
-              <w:rPr>
-                <w:spacing w:val="-2"/>
-                <w:sz w:val="20"/>
-              </w:rPr>
-              <w:t>Точка"</w:t>
+                <w:sz w:val="20"/>
+              </w:rPr>
+              <w:t>Банк получателя: ООО "Банк Точка"</w:t>
             </w:r>
           </w:p>
         </w:tc>
@@ -780,7 +369,6 @@
             <w:r>
               <w:rPr>
                 <w:b/>
-                <w:spacing w:val="-5"/>
                 <w:sz w:val="20"/>
               </w:rPr>
               <w:t>БИК</w:t>
@@ -802,7 +390,6 @@
             </w:pPr>
             <w:r>
               <w:rPr>
-                <w:spacing w:val="-2"/>
                 <w:sz w:val="20"/>
               </w:rPr>
               <w:t>044525104</w:t>
@@ -846,23 +433,12 @@
                 <w:sz w:val="20"/>
               </w:rPr>
             </w:pPr>
-            <w:proofErr w:type="spellStart"/>
             <w:r>
               <w:rPr>
                 <w:b/>
-                <w:spacing w:val="-4"/>
-                <w:sz w:val="20"/>
-              </w:rPr>
-              <w:t>Сч</w:t>
-            </w:r>
-            <w:proofErr w:type="spellEnd"/>
-            <w:r>
-              <w:rPr>
-                <w:b/>
-                <w:spacing w:val="-4"/>
-                <w:sz w:val="20"/>
-              </w:rPr>
-              <w:t>.№</w:t>
+                <w:sz w:val="20"/>
+              </w:rPr>
+              <w:t>Сч.№</w:t>
             </w:r>
           </w:p>
         </w:tc>
@@ -883,21 +459,7 @@
               <w:rPr>
                 <w:sz w:val="20"/>
               </w:rPr>
-              <w:t>к/с:</w:t>
-            </w:r>
-            <w:r>
-              <w:rPr>
-                <w:spacing w:val="-4"/>
-                <w:sz w:val="20"/>
-              </w:rPr>
-              <w:t xml:space="preserve"> </w:t>
-            </w:r>
-            <w:r>
-              <w:rPr>
-                <w:spacing w:val="-2"/>
-                <w:sz w:val="20"/>
-              </w:rPr>
-              <w:t>30101810745374525104</w:t>
+              <w:t>к/с: 30101810745374525104</w:t>
             </w:r>
           </w:p>
         </w:tc>
@@ -973,43 +535,7 @@
           <w:b/>
           <w:sz w:val="20"/>
         </w:rPr>
-        <w:t>ИП</w:t>
-      </w:r>
-      <w:r>
-        <w:rPr>
-          <w:b/>
-          <w:spacing w:val="-13"/>
-          <w:sz w:val="20"/>
-        </w:rPr>
-        <w:t xml:space="preserve"> </w:t>
-      </w:r>
-      <w:r>
-        <w:rPr>
-          <w:b/>
-          <w:sz w:val="20"/>
-        </w:rPr>
-        <w:t>КУПОРОВА</w:t>
-      </w:r>
-      <w:r>
-        <w:rPr>
-          <w:b/>
-          <w:spacing w:val="-12"/>
-          <w:sz w:val="20"/>
-        </w:rPr>
-        <w:t xml:space="preserve"> </w:t>
-      </w:r>
-      <w:r>
-        <w:rPr>
-          <w:b/>
-          <w:sz w:val="20"/>
-        </w:rPr>
-        <w:t xml:space="preserve">Е.А. </w:t>
-      </w:r>
-      <w:r>
-        <w:rPr>
-          <w:sz w:val="20"/>
-        </w:rPr>
-        <w:t>ИНН 500805209810 КПП -</w:t>
+        <w:t>ООО "ВЕРКУП" ИНН 9718284789 КПП 771801001</w:t>
       </w:r>
     </w:p>
     <w:p>
@@ -1019,75 +545,16 @@
         <w:ind w:left="567"/>
       </w:pPr>
       <w:r>
-        <w:t>Адрес:</w:t>
-      </w:r>
-      <w:r>
         <w:rPr>
           <w:spacing w:val="-6"/>
         </w:rPr>
-        <w:t xml:space="preserve"> </w:t>
-      </w:r>
-      <w:r>
-        <w:t>143930</w:t>
+        <w:t>Адрес: 107065, РОС</w:t>
       </w:r>
       <w:r>
         <w:rPr>
           <w:spacing w:val="-6"/>
         </w:rPr>
-        <w:t xml:space="preserve"> </w:t>
-      </w:r>
-      <w:r>
-        <w:t>МО,</w:t>
-      </w:r>
-      <w:r>
-        <w:rPr>
-          <w:spacing w:val="-6"/>
-        </w:rPr>
-        <w:t xml:space="preserve"> </w:t>
-      </w:r>
-      <w:r>
-        <w:t>г.</w:t>
-      </w:r>
-      <w:r>
-        <w:rPr>
-          <w:spacing w:val="-6"/>
-        </w:rPr>
-        <w:t xml:space="preserve"> </w:t>
-      </w:r>
-      <w:r>
-        <w:t>Балашиха,</w:t>
-      </w:r>
-      <w:r>
-        <w:rPr>
-          <w:spacing w:val="-6"/>
-        </w:rPr>
-        <w:t xml:space="preserve"> </w:t>
-      </w:r>
-      <w:r>
-        <w:t>Мирской</w:t>
-      </w:r>
-      <w:r>
-        <w:rPr>
-          <w:spacing w:val="-6"/>
-        </w:rPr>
-        <w:t xml:space="preserve"> </w:t>
-      </w:r>
-      <w:proofErr w:type="spellStart"/>
-      <w:r>
-        <w:t>пр</w:t>
-      </w:r>
-      <w:proofErr w:type="spellEnd"/>
-      <w:r>
-        <w:t>-д,</w:t>
-      </w:r>
-      <w:r>
-        <w:rPr>
-          <w:spacing w:val="-6"/>
-        </w:rPr>
-        <w:t xml:space="preserve"> </w:t>
-      </w:r>
-      <w:r>
-        <w:t>9 Т. 8 (909) 655-98-48</w:t>
+        <w:t>СИЯ, г МОСКВА, ул КУРГАНСКАЯ, ДОМ 3А, корпус строение 1, оф ПОМЕЩ. 1/1</w:t>
       </w:r>
     </w:p>
     <w:p>
@@ -1096,39 +563,11 @@
         <w:spacing w:before="1"/>
         <w:ind w:left="567" w:right="1428"/>
       </w:pPr>
-      <w:proofErr w:type="spellStart"/>
-      <w:r>
-        <w:t>Email</w:t>
-      </w:r>
-      <w:proofErr w:type="spellEnd"/>
-      <w:r>
-        <w:t xml:space="preserve">: </w:t>
-      </w:r>
-      <w:hyperlink r:id="rId8">
-        <w:r>
-          <w:t>kuporov.biz@yandex.ru</w:t>
-        </w:r>
-      </w:hyperlink>
-      <w:r>
-        <w:t xml:space="preserve"> Р/С</w:t>
-      </w:r>
       <w:r>
         <w:rPr>
           <w:spacing w:val="-13"/>
         </w:rPr>
-        <w:t xml:space="preserve"> </w:t>
-      </w:r>
-      <w:r>
-        <w:t>№</w:t>
-      </w:r>
-      <w:r>
-        <w:rPr>
-          <w:spacing w:val="24"/>
-        </w:rPr>
-        <w:t xml:space="preserve"> </w:t>
-      </w:r>
-      <w:r>
-        <w:t>40802810320000702819</w:t>
+        <w:t>Р/С № 40702810920000232070</w:t>
       </w:r>
     </w:p>
     <w:p>
@@ -1138,37 +577,10 @@
         <w:ind w:left="567"/>
       </w:pPr>
       <w:r>
-        <w:t>В</w:t>
-      </w:r>
-      <w:r>
         <w:rPr>
           <w:spacing w:val="-5"/>
         </w:rPr>
-        <w:t xml:space="preserve"> </w:t>
-      </w:r>
-      <w:r>
-        <w:t>ООО</w:t>
-      </w:r>
-      <w:r>
-        <w:rPr>
-          <w:spacing w:val="-5"/>
-        </w:rPr>
-        <w:t xml:space="preserve"> </w:t>
-      </w:r>
-      <w:r>
-        <w:t>«Банк</w:t>
-      </w:r>
-      <w:r>
-        <w:rPr>
-          <w:spacing w:val="-3"/>
-        </w:rPr>
-        <w:t xml:space="preserve"> </w:t>
-      </w:r>
-      <w:r>
-        <w:rPr>
-          <w:spacing w:val="-2"/>
-        </w:rPr>
-        <w:t>Точка»</w:t>
+        <w:t>В ООО "Банк Точка"</w:t>
       </w:r>
     </w:p>
     <w:p>
@@ -1183,34 +595,7 @@
         <w:rPr>
           <w:sz w:val="20"/>
         </w:rPr>
-        <w:t>К/С</w:t>
-      </w:r>
-      <w:r>
-        <w:rPr>
-          <w:spacing w:val="-4"/>
-          <w:sz w:val="20"/>
-        </w:rPr>
-        <w:t xml:space="preserve"> </w:t>
-      </w:r>
-      <w:r>
-        <w:rPr>
-          <w:sz w:val="20"/>
-        </w:rPr>
-        <w:t>№</w:t>
-      </w:r>
-      <w:r>
-        <w:rPr>
-          <w:spacing w:val="-3"/>
-          <w:sz w:val="20"/>
-        </w:rPr>
-        <w:t xml:space="preserve"> </w:t>
-      </w:r>
-      <w:r>
-        <w:rPr>
-          <w:spacing w:val="-2"/>
-          <w:sz w:val="20"/>
-        </w:rPr>
-        <w:t>30101810745374525104</w:t>
+        <w:t>К/С № 30101810745374525104</w:t>
       </w:r>
     </w:p>
     <w:p>
@@ -1225,21 +610,7 @@
         <w:rPr>
           <w:sz w:val="20"/>
         </w:rPr>
-        <w:t>БИК:</w:t>
-      </w:r>
-      <w:r>
-        <w:rPr>
-          <w:spacing w:val="-6"/>
-          <w:sz w:val="20"/>
-        </w:rPr>
-        <w:t xml:space="preserve"> </w:t>
-      </w:r>
-      <w:r>
-        <w:rPr>
-          <w:spacing w:val="-2"/>
-          <w:sz w:val="20"/>
-        </w:rPr>
-        <w:t>044525104</w:t>
+        <w:t>БИК: 044525104</w:t>
       </w:r>
     </w:p>
     <w:p>
@@ -1254,19 +625,10 @@
         <w:br w:type="column"/>
       </w:r>
       <w:r>
-        <w:t>ООО</w:t>
-      </w:r>
-      <w:r>
-        <w:rPr>
-          <w:spacing w:val="-6"/>
-        </w:rPr>
-        <w:t xml:space="preserve"> </w:t>
-      </w:r>
-      <w:r>
-        <w:rPr>
-          <w:spacing w:val="-2"/>
-        </w:rPr>
-        <w:t>"ИНТЕКТЕХНО"</w:t>
+        <w:rPr>
+          <w:b w:val="0"/>
+        </w:rPr>
+        <w:t>ООО "ИНТЕКТЕХНО"</w:t>
       </w:r>
     </w:p>
     <w:p>
@@ -1275,48 +637,10 @@
         <w:ind w:left="328" w:right="988"/>
       </w:pPr>
       <w:r>
-        <w:t>Юр.</w:t>
-      </w:r>
-      <w:r>
         <w:rPr>
           <w:spacing w:val="-9"/>
         </w:rPr>
-        <w:t xml:space="preserve"> </w:t>
-      </w:r>
-      <w:r>
-        <w:t>Адрес:</w:t>
-      </w:r>
-      <w:r>
-        <w:rPr>
-          <w:spacing w:val="-9"/>
-        </w:rPr>
-        <w:t xml:space="preserve"> </w:t>
-      </w:r>
-      <w:r>
-        <w:t>117556.</w:t>
-      </w:r>
-      <w:r>
-        <w:rPr>
-          <w:spacing w:val="-9"/>
-        </w:rPr>
-        <w:t xml:space="preserve"> </w:t>
-      </w:r>
-      <w:proofErr w:type="spellStart"/>
-      <w:r>
-        <w:t>Г.Москва</w:t>
-      </w:r>
-      <w:proofErr w:type="spellEnd"/>
-      <w:r>
-        <w:t>,</w:t>
-      </w:r>
-      <w:r>
-        <w:rPr>
-          <w:spacing w:val="-9"/>
-        </w:rPr>
-        <w:t xml:space="preserve"> </w:t>
-      </w:r>
-      <w:r>
-        <w:t>Варшавское шоссе, д. 66</w:t>
+        <w:t>Юр. Адрес: 117556, г Москва, Нагорный р-н, Варшавское шоссе, д 66</w:t>
       </w:r>
     </w:p>
     <w:p>
@@ -1331,21 +655,13 @@
         <w:rPr>
           <w:sz w:val="20"/>
         </w:rPr>
-        <w:t>ИНН:</w:t>
-      </w:r>
-      <w:r>
-        <w:rPr>
-          <w:spacing w:val="-7"/>
-          <w:sz w:val="20"/>
-        </w:rPr>
-        <w:t xml:space="preserve"> </w:t>
-      </w:r>
-      <w:r>
-        <w:rPr>
-          <w:spacing w:val="-2"/>
-          <w:sz w:val="20"/>
-        </w:rPr>
-        <w:t>7718214883</w:t>
+        <w:t xml:space="preserve">ИНН: </w:t>
+      </w:r>
+      <w:r>
+        <w:rPr>
+          <w:sz w:val="20"/>
+        </w:rPr>
+        <w:t>7718214883 КПП: 772601001</w:t>
       </w:r>
     </w:p>
     <w:p>
@@ -1360,21 +676,7 @@
         <w:rPr>
           <w:sz w:val="20"/>
         </w:rPr>
-        <w:t>ОГРН:</w:t>
-      </w:r>
-      <w:r>
-        <w:rPr>
-          <w:spacing w:val="-7"/>
-          <w:sz w:val="20"/>
-        </w:rPr>
-        <w:t xml:space="preserve"> </w:t>
-      </w:r>
-      <w:r>
-        <w:rPr>
-          <w:spacing w:val="-2"/>
-          <w:sz w:val="20"/>
-        </w:rPr>
-        <w:t>772601001</w:t>
+        <w:t>ОГРН: 1027700287471</w:t>
       </w:r>
     </w:p>
     <w:p>
@@ -1408,20 +710,6 @@
           <w:sz w:val="20"/>
         </w:rPr>
         <w:t>БИК:</w:t>
-      </w:r>
-      <w:r>
-        <w:rPr>
-          <w:spacing w:val="-6"/>
-          <w:sz w:val="20"/>
-        </w:rPr>
-        <w:t xml:space="preserve"> </w:t>
-      </w:r>
-      <w:r>
-        <w:rPr>
-          <w:spacing w:val="-2"/>
-          <w:sz w:val="20"/>
-        </w:rPr>
-        <w:t>044525685</w:t>
       </w:r>
     </w:p>
     <w:p>
@@ -1744,7 +1032,6 @@
             </w:pPr>
             <w:r>
               <w:rPr>
-                <w:spacing w:val="-5"/>
                 <w:sz w:val="20"/>
               </w:rPr>
               <w:t>1.</w:t>
@@ -1767,86 +1054,13 @@
               <w:rPr>
                 <w:sz w:val="20"/>
               </w:rPr>
-              <w:t>Изготовление</w:t>
+              <w:t xml:space="preserve">Вывеска с лицевым </w:t>
             </w:r>
             <w:r>
               <w:rPr>
-                <w:spacing w:val="-7"/>
-                <w:sz w:val="20"/>
-              </w:rPr>
-              <w:t xml:space="preserve"> </w:t>
-            </w:r>
-            <w:r>
-              <w:rPr>
-                <w:sz w:val="20"/>
-              </w:rPr>
-              <w:t>светового</w:t>
-            </w:r>
-            <w:r>
-              <w:rPr>
-                <w:spacing w:val="-6"/>
-                <w:sz w:val="20"/>
-              </w:rPr>
-              <w:t xml:space="preserve"> </w:t>
-            </w:r>
-            <w:r>
-              <w:rPr>
-                <w:sz w:val="20"/>
-              </w:rPr>
-              <w:t>короба</w:t>
-            </w:r>
-            <w:r>
-              <w:rPr>
-                <w:spacing w:val="-6"/>
-                <w:sz w:val="20"/>
-              </w:rPr>
-              <w:t xml:space="preserve"> </w:t>
-            </w:r>
-            <w:r>
-              <w:rPr>
-                <w:sz w:val="20"/>
-              </w:rPr>
-              <w:t>из</w:t>
-            </w:r>
-            <w:r>
-              <w:rPr>
-                <w:spacing w:val="-6"/>
-                <w:sz w:val="20"/>
-              </w:rPr>
-              <w:t xml:space="preserve"> </w:t>
-            </w:r>
-            <w:r>
-              <w:rPr>
-                <w:sz w:val="20"/>
-              </w:rPr>
-              <w:t>АКП</w:t>
-            </w:r>
-            <w:r>
-              <w:rPr>
-                <w:spacing w:val="-7"/>
-                <w:sz w:val="20"/>
-              </w:rPr>
-              <w:t xml:space="preserve"> </w:t>
-            </w:r>
-            <w:r>
-              <w:rPr>
-                <w:sz w:val="20"/>
-              </w:rPr>
-              <w:t>с</w:t>
-            </w:r>
-            <w:r>
-              <w:rPr>
-                <w:spacing w:val="-6"/>
-                <w:sz w:val="20"/>
-              </w:rPr>
-              <w:t xml:space="preserve"> </w:t>
-            </w:r>
-            <w:r>
-              <w:rPr>
-                <w:spacing w:val="-2"/>
-                <w:sz w:val="20"/>
-              </w:rPr>
-              <w:t>инкрустацией</w:t>
+                <w:sz w:val="20"/>
+              </w:rPr>
+              <w:t>свечением</w:t>
             </w:r>
           </w:p>
         </w:tc>
@@ -1865,21 +1079,7 @@
               <w:rPr>
                 <w:sz w:val="20"/>
               </w:rPr>
-              <w:t>1</w:t>
-            </w:r>
-            <w:r>
-              <w:rPr>
-                <w:spacing w:val="-1"/>
-                <w:sz w:val="20"/>
-              </w:rPr>
-              <w:t xml:space="preserve"> </w:t>
-            </w:r>
-            <w:r>
-              <w:rPr>
-                <w:spacing w:val="-4"/>
-                <w:sz w:val="20"/>
-              </w:rPr>
-              <w:t>(шт)</w:t>
+              <w:t>1 (шт)</w:t>
             </w:r>
           </w:p>
         </w:tc>
@@ -1898,14 +1098,7 @@
               <w:rPr>
                 <w:sz w:val="20"/>
               </w:rPr>
-              <w:t>51</w:t>
-            </w:r>
-            <w:r>
-              <w:rPr>
-                <w:spacing w:val="-2"/>
-                <w:sz w:val="20"/>
-              </w:rPr>
-              <w:t xml:space="preserve"> 000.00</w:t>
+              <w:t>12 800,00</w:t>
             </w:r>
           </w:p>
         </w:tc>
@@ -1924,461 +1117,7 @@
               <w:rPr>
                 <w:sz w:val="20"/>
               </w:rPr>
-              <w:t>51</w:t>
-            </w:r>
-            <w:r>
-              <w:rPr>
-                <w:spacing w:val="-2"/>
-                <w:sz w:val="20"/>
-              </w:rPr>
-              <w:t xml:space="preserve"> 000.00</w:t>
-            </w:r>
-          </w:p>
-        </w:tc>
-      </w:tr>
-      <w:tr>
-        <w:trPr>
-          <w:trHeight w:val="359"/>
-        </w:trPr>
-        <w:tc>
-          <w:tcPr>
-            <w:tcW w:w="504" w:type="dxa"/>
-          </w:tcPr>
-          <w:p>
-            <w:pPr>
-              <w:pStyle w:val="TableParagraph"/>
-              <w:rPr>
-                <w:sz w:val="20"/>
-              </w:rPr>
-            </w:pPr>
-            <w:r>
-              <w:rPr>
-                <w:spacing w:val="-5"/>
-                <w:sz w:val="20"/>
-              </w:rPr>
-              <w:t>2.</w:t>
-            </w:r>
-          </w:p>
-        </w:tc>
-        <w:tc>
-          <w:tcPr>
-            <w:tcW w:w="6038" w:type="dxa"/>
-            <w:gridSpan w:val="2"/>
-          </w:tcPr>
-          <w:p>
-            <w:pPr>
-              <w:pStyle w:val="TableParagraph"/>
-              <w:spacing w:before="67"/>
-              <w:rPr>
-                <w:sz w:val="20"/>
-              </w:rPr>
-            </w:pPr>
-            <w:r>
-              <w:rPr>
-                <w:sz w:val="20"/>
-              </w:rPr>
-              <w:t>Доставка</w:t>
-            </w:r>
-            <w:r>
-              <w:rPr>
-                <w:spacing w:val="-7"/>
-                <w:sz w:val="20"/>
-              </w:rPr>
-              <w:t xml:space="preserve"> </w:t>
-            </w:r>
-            <w:r>
-              <w:rPr>
-                <w:sz w:val="20"/>
-              </w:rPr>
-              <w:t>по</w:t>
-            </w:r>
-            <w:r>
-              <w:rPr>
-                <w:spacing w:val="-7"/>
-                <w:sz w:val="20"/>
-              </w:rPr>
-              <w:t xml:space="preserve"> </w:t>
-            </w:r>
-            <w:r>
-              <w:rPr>
-                <w:sz w:val="20"/>
-              </w:rPr>
-              <w:t>г.</w:t>
-            </w:r>
-            <w:r>
-              <w:rPr>
-                <w:spacing w:val="-6"/>
-                <w:sz w:val="20"/>
-              </w:rPr>
-              <w:t xml:space="preserve"> </w:t>
-            </w:r>
-            <w:proofErr w:type="spellStart"/>
-            <w:r>
-              <w:rPr>
-                <w:sz w:val="20"/>
-              </w:rPr>
-              <w:t>Москвап</w:t>
-            </w:r>
-            <w:proofErr w:type="spellEnd"/>
-            <w:r>
-              <w:rPr>
-                <w:sz w:val="20"/>
-              </w:rPr>
-              <w:t>,</w:t>
-            </w:r>
-            <w:r>
-              <w:rPr>
-                <w:spacing w:val="-7"/>
-                <w:sz w:val="20"/>
-              </w:rPr>
-              <w:t xml:space="preserve"> </w:t>
-            </w:r>
-            <w:r>
-              <w:rPr>
-                <w:sz w:val="20"/>
-              </w:rPr>
-              <w:t>монтаж</w:t>
-            </w:r>
-            <w:r>
-              <w:rPr>
-                <w:spacing w:val="-7"/>
-                <w:sz w:val="20"/>
-              </w:rPr>
-              <w:t xml:space="preserve"> </w:t>
-            </w:r>
-            <w:r>
-              <w:rPr>
-                <w:sz w:val="20"/>
-              </w:rPr>
-              <w:t>и</w:t>
-            </w:r>
-            <w:r>
-              <w:rPr>
-                <w:spacing w:val="-7"/>
-                <w:sz w:val="20"/>
-              </w:rPr>
-              <w:t xml:space="preserve"> </w:t>
-            </w:r>
-            <w:r>
-              <w:rPr>
-                <w:sz w:val="20"/>
-              </w:rPr>
-              <w:t>пусконаладочные</w:t>
-            </w:r>
-            <w:r>
-              <w:rPr>
-                <w:spacing w:val="-6"/>
-                <w:sz w:val="20"/>
-              </w:rPr>
-              <w:t xml:space="preserve"> </w:t>
-            </w:r>
-            <w:r>
-              <w:rPr>
-                <w:spacing w:val="-2"/>
-                <w:sz w:val="20"/>
-              </w:rPr>
-              <w:t>работы</w:t>
-            </w:r>
-          </w:p>
-        </w:tc>
-        <w:tc>
-          <w:tcPr>
-            <w:tcW w:w="1061" w:type="dxa"/>
-          </w:tcPr>
-          <w:p>
-            <w:pPr>
-              <w:pStyle w:val="TableParagraph"/>
-              <w:rPr>
-                <w:sz w:val="20"/>
-              </w:rPr>
-            </w:pPr>
-            <w:r>
-              <w:rPr>
-                <w:sz w:val="20"/>
-              </w:rPr>
-              <w:t>1</w:t>
-            </w:r>
-            <w:r>
-              <w:rPr>
-                <w:spacing w:val="-1"/>
-                <w:sz w:val="20"/>
-              </w:rPr>
-              <w:t xml:space="preserve"> </w:t>
-            </w:r>
-            <w:r>
-              <w:rPr>
-                <w:spacing w:val="-2"/>
-                <w:sz w:val="20"/>
-              </w:rPr>
-              <w:t>(</w:t>
-            </w:r>
-            <w:proofErr w:type="spellStart"/>
-            <w:r>
-              <w:rPr>
-                <w:spacing w:val="-2"/>
-                <w:sz w:val="20"/>
-              </w:rPr>
-              <w:t>компл</w:t>
-            </w:r>
-            <w:proofErr w:type="spellEnd"/>
-            <w:r>
-              <w:rPr>
-                <w:spacing w:val="-2"/>
-                <w:sz w:val="20"/>
-              </w:rPr>
-              <w:t>)</w:t>
-            </w:r>
-          </w:p>
-        </w:tc>
-        <w:tc>
-          <w:tcPr>
-            <w:tcW w:w="1133" w:type="dxa"/>
-          </w:tcPr>
-          <w:p>
-            <w:pPr>
-              <w:pStyle w:val="TableParagraph"/>
-              <w:rPr>
-                <w:sz w:val="20"/>
-              </w:rPr>
-            </w:pPr>
-            <w:r>
-              <w:rPr>
-                <w:sz w:val="20"/>
-              </w:rPr>
-              <w:t>10</w:t>
-            </w:r>
-            <w:r>
-              <w:rPr>
-                <w:spacing w:val="-2"/>
-                <w:sz w:val="20"/>
-              </w:rPr>
-              <w:t xml:space="preserve"> 000.00</w:t>
-            </w:r>
-          </w:p>
-        </w:tc>
-        <w:tc>
-          <w:tcPr>
-            <w:tcW w:w="1219" w:type="dxa"/>
-          </w:tcPr>
-          <w:p>
-            <w:pPr>
-              <w:pStyle w:val="TableParagraph"/>
-              <w:rPr>
-                <w:sz w:val="20"/>
-              </w:rPr>
-            </w:pPr>
-            <w:r>
-              <w:rPr>
-                <w:sz w:val="20"/>
-              </w:rPr>
-              <w:t>10</w:t>
-            </w:r>
-            <w:r>
-              <w:rPr>
-                <w:spacing w:val="-2"/>
-                <w:sz w:val="20"/>
-              </w:rPr>
-              <w:t xml:space="preserve"> 000.00</w:t>
-            </w:r>
-          </w:p>
-        </w:tc>
-      </w:tr>
-      <w:tr>
-        <w:trPr>
-          <w:trHeight w:val="354"/>
-        </w:trPr>
-        <w:tc>
-          <w:tcPr>
-            <w:tcW w:w="504" w:type="dxa"/>
-          </w:tcPr>
-          <w:p>
-            <w:pPr>
-              <w:pStyle w:val="TableParagraph"/>
-              <w:rPr>
-                <w:sz w:val="20"/>
-              </w:rPr>
-            </w:pPr>
-            <w:r>
-              <w:rPr>
-                <w:sz w:val="20"/>
-              </w:rPr>
-              <w:t>3</w:t>
-            </w:r>
-          </w:p>
-        </w:tc>
-        <w:tc>
-          <w:tcPr>
-            <w:tcW w:w="6038" w:type="dxa"/>
-            <w:gridSpan w:val="2"/>
-          </w:tcPr>
-          <w:p>
-            <w:pPr>
-              <w:pStyle w:val="TableParagraph"/>
-              <w:spacing w:before="62"/>
-              <w:rPr>
-                <w:sz w:val="20"/>
-              </w:rPr>
-            </w:pPr>
-            <w:r>
-              <w:rPr>
-                <w:sz w:val="20"/>
-              </w:rPr>
-              <w:t>Демонтаж</w:t>
-            </w:r>
-            <w:r>
-              <w:rPr>
-                <w:spacing w:val="-12"/>
-                <w:sz w:val="20"/>
-              </w:rPr>
-              <w:t xml:space="preserve"> </w:t>
-            </w:r>
-            <w:r>
-              <w:rPr>
-                <w:sz w:val="20"/>
-              </w:rPr>
-              <w:t>и</w:t>
-            </w:r>
-            <w:r>
-              <w:rPr>
-                <w:spacing w:val="-9"/>
-                <w:sz w:val="20"/>
-              </w:rPr>
-              <w:t xml:space="preserve"> </w:t>
-            </w:r>
-            <w:r>
-              <w:rPr>
-                <w:sz w:val="20"/>
-              </w:rPr>
-              <w:t>утилизация</w:t>
-            </w:r>
-            <w:r>
-              <w:rPr>
-                <w:spacing w:val="-9"/>
-                <w:sz w:val="20"/>
-              </w:rPr>
-              <w:t xml:space="preserve"> </w:t>
-            </w:r>
-            <w:r>
-              <w:rPr>
-                <w:sz w:val="20"/>
-              </w:rPr>
-              <w:t>существующих</w:t>
-            </w:r>
-            <w:r>
-              <w:rPr>
-                <w:spacing w:val="-9"/>
-                <w:sz w:val="20"/>
-              </w:rPr>
-              <w:t xml:space="preserve"> </w:t>
-            </w:r>
-            <w:r>
-              <w:rPr>
-                <w:spacing w:val="-2"/>
-                <w:sz w:val="20"/>
-              </w:rPr>
-              <w:t>конструкций</w:t>
-            </w:r>
-          </w:p>
-        </w:tc>
-        <w:tc>
-          <w:tcPr>
-            <w:tcW w:w="1061" w:type="dxa"/>
-          </w:tcPr>
-          <w:p>
-            <w:pPr>
-              <w:pStyle w:val="TableParagraph"/>
-              <w:spacing w:before="62"/>
-              <w:rPr>
-                <w:sz w:val="20"/>
-              </w:rPr>
-            </w:pPr>
-            <w:r>
-              <w:rPr>
-                <w:sz w:val="20"/>
-              </w:rPr>
-              <w:t>1</w:t>
-            </w:r>
-            <w:r>
-              <w:rPr>
-                <w:spacing w:val="-1"/>
-                <w:sz w:val="20"/>
-              </w:rPr>
-              <w:t xml:space="preserve"> </w:t>
-            </w:r>
-            <w:proofErr w:type="spellStart"/>
-            <w:r>
-              <w:rPr>
-                <w:spacing w:val="-4"/>
-                <w:sz w:val="20"/>
-              </w:rPr>
-              <w:t>компл</w:t>
-            </w:r>
-            <w:proofErr w:type="spellEnd"/>
-          </w:p>
-        </w:tc>
-        <w:tc>
-          <w:tcPr>
-            <w:tcW w:w="1133" w:type="dxa"/>
-          </w:tcPr>
-          <w:p>
-            <w:pPr>
-              <w:pStyle w:val="TableParagraph"/>
-              <w:rPr>
-                <w:sz w:val="20"/>
-              </w:rPr>
-            </w:pPr>
-            <w:r>
-              <w:rPr>
-                <w:sz w:val="20"/>
-              </w:rPr>
-              <w:t>5</w:t>
-            </w:r>
-            <w:r>
-              <w:rPr>
-                <w:spacing w:val="-1"/>
-                <w:sz w:val="20"/>
-              </w:rPr>
-              <w:t xml:space="preserve"> </w:t>
-            </w:r>
-            <w:r>
-              <w:rPr>
-                <w:spacing w:val="-2"/>
-                <w:sz w:val="20"/>
-              </w:rPr>
-              <w:t>000.00</w:t>
-            </w:r>
-          </w:p>
-        </w:tc>
-        <w:tc>
-          <w:tcPr>
-            <w:tcW w:w="1219" w:type="dxa"/>
-          </w:tcPr>
-          <w:p>
-            <w:pPr>
-              <w:pStyle w:val="TableParagraph"/>
-              <w:rPr>
-                <w:sz w:val="20"/>
-              </w:rPr>
-            </w:pPr>
-            <w:r>
-              <w:rPr>
-                <w:sz w:val="20"/>
-              </w:rPr>
-              <w:t>5</w:t>
-            </w:r>
-            <w:r>
-              <w:rPr>
-                <w:spacing w:val="-1"/>
-                <w:sz w:val="20"/>
-              </w:rPr>
-              <w:t xml:space="preserve"> </w:t>
-            </w:r>
-            <w:r>
-              <w:rPr>
-                <w:spacing w:val="-2"/>
-                <w:sz w:val="20"/>
-              </w:rPr>
-              <w:t>000.00</w:t>
+              <w:t>12 800,00</w:t>
             </w:r>
           </w:p>
         </w:tc>
@@ -2418,47 +1157,7 @@
               <w:rPr>
                 <w:sz w:val="20"/>
               </w:rPr>
-              <w:t>Итого</w:t>
-            </w:r>
-            <w:r>
-              <w:rPr>
-                <w:spacing w:val="-5"/>
-                <w:sz w:val="20"/>
-              </w:rPr>
-              <w:t xml:space="preserve"> </w:t>
-            </w:r>
-            <w:r>
-              <w:rPr>
-                <w:sz w:val="20"/>
-              </w:rPr>
-              <w:t>с</w:t>
-            </w:r>
-            <w:r>
-              <w:rPr>
-                <w:spacing w:val="-4"/>
-                <w:sz w:val="20"/>
-              </w:rPr>
-              <w:t xml:space="preserve"> </w:t>
-            </w:r>
-            <w:r>
-              <w:rPr>
-                <w:sz w:val="20"/>
-              </w:rPr>
-              <w:t>НДС</w:t>
-            </w:r>
-            <w:r>
-              <w:rPr>
-                <w:spacing w:val="-4"/>
-                <w:sz w:val="20"/>
-              </w:rPr>
-              <w:t xml:space="preserve"> </w:t>
-            </w:r>
-            <w:r>
-              <w:rPr>
-                <w:spacing w:val="-5"/>
-                <w:sz w:val="20"/>
-              </w:rPr>
-              <w:t>5%</w:t>
+              <w:t>Итого с НДС 22%</w:t>
             </w:r>
           </w:p>
         </w:tc>
@@ -2478,14 +1177,7 @@
               <w:rPr>
                 <w:sz w:val="20"/>
               </w:rPr>
-              <w:t>66</w:t>
-            </w:r>
-            <w:r>
-              <w:rPr>
-                <w:spacing w:val="-2"/>
-                <w:sz w:val="20"/>
-              </w:rPr>
-              <w:t xml:space="preserve"> 000.00</w:t>
+              <w:t>12 800,00</w:t>
             </w:r>
           </w:p>
         </w:tc>
@@ -2529,113 +1221,7 @@
                 <w:i/>
                 <w:sz w:val="20"/>
               </w:rPr>
-              <w:t>Сумма</w:t>
-            </w:r>
-            <w:r>
-              <w:rPr>
-                <w:i/>
-                <w:spacing w:val="-10"/>
-                <w:sz w:val="20"/>
-              </w:rPr>
-              <w:t xml:space="preserve"> </w:t>
-            </w:r>
-            <w:r>
-              <w:rPr>
-                <w:i/>
-                <w:sz w:val="20"/>
-              </w:rPr>
-              <w:t>прописью:</w:t>
-            </w:r>
-            <w:r>
-              <w:rPr>
-                <w:i/>
-                <w:spacing w:val="-7"/>
-                <w:sz w:val="20"/>
-              </w:rPr>
-              <w:t xml:space="preserve"> </w:t>
-            </w:r>
-            <w:r>
-              <w:rPr>
-                <w:i/>
-                <w:sz w:val="20"/>
-              </w:rPr>
-              <w:t>Шестьдесят</w:t>
-            </w:r>
-            <w:r>
-              <w:rPr>
-                <w:i/>
-                <w:spacing w:val="-9"/>
-                <w:sz w:val="20"/>
-              </w:rPr>
-              <w:t xml:space="preserve"> </w:t>
-            </w:r>
-            <w:r>
-              <w:rPr>
-                <w:i/>
-                <w:sz w:val="20"/>
-              </w:rPr>
-              <w:t>шесть</w:t>
-            </w:r>
-            <w:r>
-              <w:rPr>
-                <w:i/>
-                <w:spacing w:val="-7"/>
-                <w:sz w:val="20"/>
-              </w:rPr>
-              <w:t xml:space="preserve"> </w:t>
-            </w:r>
-            <w:r>
-              <w:rPr>
-                <w:i/>
-                <w:sz w:val="20"/>
-              </w:rPr>
-              <w:t>тысяч</w:t>
-            </w:r>
-            <w:r>
-              <w:rPr>
-                <w:i/>
-                <w:spacing w:val="-8"/>
-                <w:sz w:val="20"/>
-              </w:rPr>
-              <w:t xml:space="preserve"> </w:t>
-            </w:r>
-            <w:r>
-              <w:rPr>
-                <w:i/>
-                <w:sz w:val="20"/>
-              </w:rPr>
-              <w:t>рублей,</w:t>
-            </w:r>
-            <w:r>
-              <w:rPr>
-                <w:i/>
-                <w:spacing w:val="-7"/>
-                <w:sz w:val="20"/>
-              </w:rPr>
-              <w:t xml:space="preserve"> </w:t>
-            </w:r>
-            <w:r>
-              <w:rPr>
-                <w:i/>
-                <w:sz w:val="20"/>
-              </w:rPr>
-              <w:t>00</w:t>
-            </w:r>
-            <w:r>
-              <w:rPr>
-                <w:i/>
-                <w:spacing w:val="-7"/>
-                <w:sz w:val="20"/>
-              </w:rPr>
-              <w:t xml:space="preserve"> </w:t>
-            </w:r>
-            <w:r>
-              <w:rPr>
-                <w:i/>
-                <w:spacing w:val="-4"/>
-                <w:sz w:val="20"/>
-              </w:rPr>
-              <w:t>коп.</w:t>
+              <w:t>Сумма прописью: Двенадцать тысяч восемьсот рублей 00 копеек</w:t>
             </w:r>
           </w:p>
         </w:tc>
@@ -2659,70 +1245,9 @@
       </w:pPr>
       <w:r>
         <w:rPr>
-          <w:b/>
-          <w:sz w:val="20"/>
-        </w:rPr>
-        <w:t>Адрес</w:t>
-      </w:r>
-      <w:r>
-        <w:rPr>
-          <w:b/>
-          <w:spacing w:val="-7"/>
-          <w:sz w:val="20"/>
-        </w:rPr>
-        <w:t xml:space="preserve"> </w:t>
-      </w:r>
-      <w:r>
-        <w:rPr>
-          <w:b/>
-          <w:sz w:val="20"/>
-        </w:rPr>
-        <w:t>доставки</w:t>
-      </w:r>
-      <w:r>
-        <w:rPr>
-          <w:b/>
-          <w:spacing w:val="-6"/>
-          <w:sz w:val="20"/>
-        </w:rPr>
-        <w:t xml:space="preserve"> </w:t>
-      </w:r>
-      <w:r>
-        <w:rPr>
-          <w:b/>
-          <w:sz w:val="20"/>
-        </w:rPr>
-        <w:t>и</w:t>
-      </w:r>
-      <w:r>
-        <w:rPr>
-          <w:b/>
-          <w:spacing w:val="-6"/>
-          <w:sz w:val="20"/>
-        </w:rPr>
-        <w:t xml:space="preserve"> </w:t>
-      </w:r>
-      <w:r>
-        <w:rPr>
-          <w:b/>
-          <w:sz w:val="20"/>
-        </w:rPr>
-        <w:t>установки:</w:t>
-      </w:r>
-      <w:r>
-        <w:rPr>
-          <w:b/>
-          <w:spacing w:val="-6"/>
-          <w:sz w:val="20"/>
-        </w:rPr>
-        <w:t xml:space="preserve"> </w:t>
-      </w:r>
-      <w:r>
-        <w:rPr>
-          <w:spacing w:val="-2"/>
-          <w:sz w:val="20"/>
-        </w:rPr>
-        <w:t>Самовывоз</w:t>
+          <w:sz w:val="20"/>
+        </w:rPr>
+        <w:t>Адрес доставки и установки: Самовывоз</w:t>
       </w:r>
     </w:p>
     <w:p>
@@ -2948,174 +1473,13 @@
         <w:rPr>
           <w:sz w:val="20"/>
         </w:rPr>
-        <w:t>Оплата</w:t>
-      </w:r>
-      <w:r>
-        <w:rPr>
-          <w:spacing w:val="-4"/>
-          <w:sz w:val="20"/>
-        </w:rPr>
-        <w:t xml:space="preserve"> </w:t>
-      </w:r>
-      <w:r>
-        <w:rPr>
-          <w:sz w:val="20"/>
-        </w:rPr>
-        <w:t>настоящего</w:t>
-      </w:r>
-      <w:r>
-        <w:rPr>
-          <w:spacing w:val="-4"/>
-          <w:sz w:val="20"/>
-        </w:rPr>
-        <w:t xml:space="preserve"> </w:t>
-      </w:r>
-      <w:r>
-        <w:rPr>
-          <w:sz w:val="20"/>
-        </w:rPr>
-        <w:t>Счет-Договора</w:t>
-      </w:r>
-      <w:r>
-        <w:rPr>
-          <w:spacing w:val="-4"/>
-          <w:sz w:val="20"/>
-        </w:rPr>
-        <w:t xml:space="preserve"> </w:t>
-      </w:r>
-      <w:r>
-        <w:rPr>
-          <w:sz w:val="20"/>
-        </w:rPr>
-        <w:t>производится</w:t>
-      </w:r>
-      <w:r>
-        <w:rPr>
-          <w:spacing w:val="-4"/>
-          <w:sz w:val="20"/>
-        </w:rPr>
-        <w:t xml:space="preserve"> </w:t>
-      </w:r>
-      <w:r>
-        <w:rPr>
-          <w:sz w:val="20"/>
-        </w:rPr>
-        <w:t>следующим</w:t>
-      </w:r>
-      <w:r>
-        <w:rPr>
-          <w:spacing w:val="-5"/>
-          <w:sz w:val="20"/>
-        </w:rPr>
-        <w:t xml:space="preserve"> </w:t>
-      </w:r>
-      <w:r>
-        <w:rPr>
-          <w:sz w:val="20"/>
-        </w:rPr>
-        <w:t>образом:</w:t>
-      </w:r>
-      <w:r>
-        <w:rPr>
-          <w:spacing w:val="-4"/>
-          <w:sz w:val="20"/>
-        </w:rPr>
-        <w:t xml:space="preserve"> </w:t>
-      </w:r>
-      <w:r>
-        <w:rPr>
-          <w:sz w:val="20"/>
-        </w:rPr>
-        <w:t>Предоплата</w:t>
-      </w:r>
-      <w:r>
-        <w:rPr>
-          <w:spacing w:val="-4"/>
-          <w:sz w:val="20"/>
-        </w:rPr>
-        <w:t xml:space="preserve"> </w:t>
-      </w:r>
-      <w:r>
-        <w:rPr>
-          <w:sz w:val="20"/>
-        </w:rPr>
-        <w:t>в</w:t>
-      </w:r>
-      <w:r>
-        <w:rPr>
-          <w:spacing w:val="-4"/>
-          <w:sz w:val="20"/>
-        </w:rPr>
-        <w:t xml:space="preserve"> </w:t>
-      </w:r>
-      <w:r>
-        <w:rPr>
-          <w:sz w:val="20"/>
-        </w:rPr>
-        <w:t>размере</w:t>
-      </w:r>
-      <w:r>
-        <w:rPr>
-          <w:spacing w:val="-3"/>
-          <w:sz w:val="20"/>
-        </w:rPr>
-        <w:t xml:space="preserve"> </w:t>
-      </w:r>
-      <w:r>
-        <w:rPr>
-          <w:b/>
-          <w:sz w:val="20"/>
-        </w:rPr>
-        <w:t>66</w:t>
-      </w:r>
-      <w:r>
-        <w:rPr>
-          <w:b/>
-          <w:spacing w:val="-4"/>
-          <w:sz w:val="20"/>
-        </w:rPr>
-        <w:t xml:space="preserve"> </w:t>
-      </w:r>
-      <w:r>
-        <w:rPr>
-          <w:b/>
-          <w:sz w:val="20"/>
-        </w:rPr>
-        <w:t xml:space="preserve">000 </w:t>
-      </w:r>
-      <w:r>
-        <w:rPr>
-          <w:sz w:val="20"/>
-        </w:rPr>
-        <w:t>руб. (</w:t>
-      </w:r>
-      <w:r>
-        <w:rPr>
-          <w:i/>
-          <w:sz w:val="20"/>
-        </w:rPr>
-        <w:t>Шестьдесят шесть тысяч рублей, 00</w:t>
-      </w:r>
-      <w:r>
-        <w:rPr>
-          <w:i/>
-          <w:spacing w:val="40"/>
-          <w:sz w:val="20"/>
-        </w:rPr>
-        <w:t xml:space="preserve"> </w:t>
-      </w:r>
-      <w:r>
-        <w:rPr>
-          <w:sz w:val="20"/>
-        </w:rPr>
-        <w:t xml:space="preserve">копеек) в течение 5 (пяти) рабочих дней от даты его </w:t>
-      </w:r>
-      <w:r>
-        <w:rPr>
-          <w:spacing w:val="-2"/>
-          <w:sz w:val="20"/>
-        </w:rPr>
-        <w:t>составления.</w:t>
+        <w:t>Оплата настоящего Счет-Договора производится следующим образом: Предоплата 70% в размере 8 960 руб. (Восемь тысяч девятьсот шестьдесят рублей 0</w:t>
+      </w:r>
+      <w:r>
+        <w:rPr>
+          <w:sz w:val="20"/>
+        </w:rPr>
+        <w:t>0 копеек) в течение 5 (пяти) рабочих дней от даты его составления, оплата остатка 30% в размере 3 840 руб. (Три тысячи восемьсот сорок рублей 00 копеек) после подписания УПД.</w:t>
       </w:r>
     </w:p>
     <w:p>
@@ -3435,329 +1799,13 @@
         <w:rPr>
           <w:sz w:val="20"/>
         </w:rPr>
-        <w:t>Поставщик</w:t>
-      </w:r>
-      <w:r>
-        <w:rPr>
-          <w:spacing w:val="-3"/>
-          <w:sz w:val="20"/>
-        </w:rPr>
-        <w:t xml:space="preserve"> </w:t>
-      </w:r>
-      <w:r>
-        <w:rPr>
-          <w:sz w:val="20"/>
-        </w:rPr>
-        <w:t>обязан</w:t>
-      </w:r>
-      <w:r>
-        <w:rPr>
-          <w:spacing w:val="-3"/>
-          <w:sz w:val="20"/>
-        </w:rPr>
-        <w:t xml:space="preserve"> </w:t>
-      </w:r>
-      <w:r>
-        <w:rPr>
-          <w:sz w:val="20"/>
-        </w:rPr>
-        <w:t>доставить</w:t>
-      </w:r>
-      <w:r>
-        <w:rPr>
-          <w:spacing w:val="-3"/>
-          <w:sz w:val="20"/>
-        </w:rPr>
-        <w:t xml:space="preserve"> </w:t>
-      </w:r>
-      <w:r>
-        <w:rPr>
-          <w:sz w:val="20"/>
-        </w:rPr>
-        <w:t>(отгрузить)</w:t>
-      </w:r>
-      <w:r>
-        <w:rPr>
-          <w:spacing w:val="-3"/>
-          <w:sz w:val="20"/>
-        </w:rPr>
-        <w:t xml:space="preserve"> </w:t>
-      </w:r>
-      <w:r>
-        <w:rPr>
-          <w:sz w:val="20"/>
-        </w:rPr>
-        <w:t>оплаченный</w:t>
-      </w:r>
-      <w:r>
-        <w:rPr>
-          <w:spacing w:val="-3"/>
-          <w:sz w:val="20"/>
-        </w:rPr>
-        <w:t xml:space="preserve"> </w:t>
-      </w:r>
-      <w:r>
-        <w:rPr>
-          <w:sz w:val="20"/>
-        </w:rPr>
-        <w:t>товар</w:t>
-      </w:r>
-      <w:r>
-        <w:rPr>
-          <w:spacing w:val="-3"/>
-          <w:sz w:val="20"/>
-        </w:rPr>
-        <w:t xml:space="preserve"> </w:t>
-      </w:r>
-      <w:r>
-        <w:rPr>
-          <w:sz w:val="20"/>
-        </w:rPr>
-        <w:t>и</w:t>
-      </w:r>
-      <w:r>
-        <w:rPr>
-          <w:spacing w:val="-3"/>
-          <w:sz w:val="20"/>
-        </w:rPr>
-        <w:t xml:space="preserve"> </w:t>
-      </w:r>
-      <w:r>
-        <w:rPr>
-          <w:sz w:val="20"/>
-        </w:rPr>
-        <w:t>передать</w:t>
-      </w:r>
-      <w:r>
-        <w:rPr>
-          <w:spacing w:val="-3"/>
-          <w:sz w:val="20"/>
-        </w:rPr>
-        <w:t xml:space="preserve"> </w:t>
-      </w:r>
-      <w:r>
-        <w:rPr>
-          <w:sz w:val="20"/>
-        </w:rPr>
-        <w:t>его</w:t>
-      </w:r>
-      <w:r>
-        <w:rPr>
-          <w:spacing w:val="-3"/>
-          <w:sz w:val="20"/>
-        </w:rPr>
-        <w:t xml:space="preserve"> </w:t>
-      </w:r>
-      <w:r>
-        <w:rPr>
-          <w:sz w:val="20"/>
-        </w:rPr>
-        <w:t>Заказчику</w:t>
-      </w:r>
-      <w:r>
-        <w:rPr>
-          <w:spacing w:val="-6"/>
-          <w:sz w:val="20"/>
-        </w:rPr>
-        <w:t xml:space="preserve"> </w:t>
-      </w:r>
-      <w:r>
-        <w:rPr>
-          <w:b/>
-          <w:sz w:val="20"/>
-        </w:rPr>
-        <w:t>в</w:t>
-      </w:r>
-      <w:r>
-        <w:rPr>
-          <w:b/>
-          <w:spacing w:val="-3"/>
-          <w:sz w:val="20"/>
-        </w:rPr>
-        <w:t xml:space="preserve"> </w:t>
-      </w:r>
-      <w:r>
-        <w:rPr>
-          <w:b/>
-          <w:sz w:val="20"/>
-        </w:rPr>
-        <w:t>течение</w:t>
-      </w:r>
-      <w:r>
-        <w:rPr>
-          <w:b/>
-          <w:spacing w:val="-3"/>
-          <w:sz w:val="20"/>
-        </w:rPr>
-        <w:t xml:space="preserve"> </w:t>
-      </w:r>
-      <w:r>
-        <w:rPr>
-          <w:b/>
-          <w:sz w:val="20"/>
-        </w:rPr>
-        <w:t>10 (десяти)</w:t>
-      </w:r>
-      <w:r>
-        <w:rPr>
-          <w:b/>
-          <w:spacing w:val="-1"/>
-          <w:sz w:val="20"/>
-        </w:rPr>
-        <w:t xml:space="preserve"> </w:t>
-      </w:r>
-      <w:r>
-        <w:rPr>
-          <w:b/>
-          <w:sz w:val="20"/>
-        </w:rPr>
-        <w:t>рабочих</w:t>
-      </w:r>
-      <w:r>
-        <w:rPr>
-          <w:b/>
-          <w:spacing w:val="-1"/>
-          <w:sz w:val="20"/>
-        </w:rPr>
-        <w:t xml:space="preserve"> </w:t>
-      </w:r>
-      <w:r>
-        <w:rPr>
-          <w:b/>
-          <w:sz w:val="20"/>
-        </w:rPr>
-        <w:t>дней</w:t>
-      </w:r>
-      <w:r>
-        <w:rPr>
-          <w:b/>
-          <w:spacing w:val="-1"/>
-          <w:sz w:val="20"/>
-        </w:rPr>
-        <w:t xml:space="preserve"> </w:t>
-      </w:r>
-      <w:r>
-        <w:rPr>
-          <w:sz w:val="20"/>
-        </w:rPr>
-        <w:t>с</w:t>
-      </w:r>
-      <w:r>
-        <w:rPr>
-          <w:spacing w:val="-1"/>
-          <w:sz w:val="20"/>
-        </w:rPr>
-        <w:t xml:space="preserve"> </w:t>
-      </w:r>
-      <w:r>
-        <w:rPr>
-          <w:sz w:val="20"/>
-        </w:rPr>
-        <w:t>момента</w:t>
-      </w:r>
-      <w:r>
-        <w:rPr>
-          <w:spacing w:val="-1"/>
-          <w:sz w:val="20"/>
-        </w:rPr>
-        <w:t xml:space="preserve"> </w:t>
-      </w:r>
-      <w:r>
-        <w:rPr>
-          <w:sz w:val="20"/>
-        </w:rPr>
-        <w:t>зачисления</w:t>
-      </w:r>
-      <w:r>
-        <w:rPr>
-          <w:spacing w:val="-1"/>
-          <w:sz w:val="20"/>
-        </w:rPr>
-        <w:t xml:space="preserve"> </w:t>
-      </w:r>
-      <w:r>
-        <w:rPr>
-          <w:sz w:val="20"/>
-        </w:rPr>
-        <w:t>оплаты</w:t>
-      </w:r>
-      <w:r>
-        <w:rPr>
-          <w:spacing w:val="-2"/>
-          <w:sz w:val="20"/>
-        </w:rPr>
-        <w:t xml:space="preserve"> </w:t>
-      </w:r>
-      <w:r>
-        <w:rPr>
-          <w:sz w:val="20"/>
-        </w:rPr>
-        <w:t>на</w:t>
-      </w:r>
-      <w:r>
-        <w:rPr>
-          <w:spacing w:val="-1"/>
-          <w:sz w:val="20"/>
-        </w:rPr>
-        <w:t xml:space="preserve"> </w:t>
-      </w:r>
-      <w:r>
-        <w:rPr>
-          <w:sz w:val="20"/>
-        </w:rPr>
-        <w:t>расчетный</w:t>
-      </w:r>
-      <w:r>
-        <w:rPr>
-          <w:spacing w:val="-1"/>
-          <w:sz w:val="20"/>
-        </w:rPr>
-        <w:t xml:space="preserve"> </w:t>
-      </w:r>
-      <w:r>
-        <w:rPr>
-          <w:sz w:val="20"/>
-        </w:rPr>
-        <w:t>счет</w:t>
-      </w:r>
-      <w:r>
-        <w:rPr>
-          <w:spacing w:val="-1"/>
-          <w:sz w:val="20"/>
-        </w:rPr>
-        <w:t xml:space="preserve"> </w:t>
-      </w:r>
-      <w:r>
-        <w:rPr>
-          <w:sz w:val="20"/>
-        </w:rPr>
-        <w:t>Поставщика</w:t>
-      </w:r>
-      <w:r>
-        <w:rPr>
-          <w:spacing w:val="-1"/>
-          <w:sz w:val="20"/>
-        </w:rPr>
-        <w:t xml:space="preserve"> </w:t>
-      </w:r>
-      <w:r>
-        <w:rPr>
-          <w:sz w:val="20"/>
-        </w:rPr>
-        <w:t>и</w:t>
-      </w:r>
-      <w:r>
-        <w:rPr>
-          <w:spacing w:val="-1"/>
-          <w:sz w:val="20"/>
-        </w:rPr>
-        <w:t xml:space="preserve"> </w:t>
-      </w:r>
-      <w:r>
-        <w:rPr>
-          <w:sz w:val="20"/>
-        </w:rPr>
-        <w:t>согласования макета Сторонами.</w:t>
+        <w:t>Поставщик обязан до</w:t>
+      </w:r>
+      <w:r>
+        <w:rPr>
+          <w:sz w:val="20"/>
+        </w:rPr>
+        <w:t>ставить (отгрузить) оплаченный товар и передать его Заказчику в течение 10 (десяти) рабочих дней с момента зачисления оплаты на расчетный счет Поставщика и согласования макета Сторонами.</w:t>
       </w:r>
     </w:p>
     <w:p>
@@ -4757,138 +2805,7 @@
         <w:rPr>
           <w:sz w:val="20"/>
         </w:rPr>
-        <w:t>Гарантия</w:t>
-      </w:r>
-      <w:r>
-        <w:rPr>
-          <w:spacing w:val="-9"/>
-          <w:sz w:val="20"/>
-        </w:rPr>
-        <w:t xml:space="preserve"> </w:t>
-      </w:r>
-      <w:r>
-        <w:rPr>
-          <w:sz w:val="20"/>
-        </w:rPr>
-        <w:t>на</w:t>
-      </w:r>
-      <w:r>
-        <w:rPr>
-          <w:spacing w:val="-6"/>
-          <w:sz w:val="20"/>
-        </w:rPr>
-        <w:t xml:space="preserve"> </w:t>
-      </w:r>
-      <w:r>
-        <w:rPr>
-          <w:sz w:val="20"/>
-        </w:rPr>
-        <w:t>поставляемый</w:t>
-      </w:r>
-      <w:r>
-        <w:rPr>
-          <w:spacing w:val="-6"/>
-          <w:sz w:val="20"/>
-        </w:rPr>
-        <w:t xml:space="preserve"> </w:t>
-      </w:r>
-      <w:r>
-        <w:rPr>
-          <w:sz w:val="20"/>
-        </w:rPr>
-        <w:t>товар</w:t>
-      </w:r>
-      <w:r>
-        <w:rPr>
-          <w:spacing w:val="-6"/>
-          <w:sz w:val="20"/>
-        </w:rPr>
-        <w:t xml:space="preserve"> </w:t>
-      </w:r>
-      <w:r>
-        <w:rPr>
-          <w:sz w:val="20"/>
-        </w:rPr>
-        <w:t>составляет</w:t>
-      </w:r>
-      <w:r>
-        <w:rPr>
-          <w:spacing w:val="-7"/>
-          <w:sz w:val="20"/>
-        </w:rPr>
-        <w:t xml:space="preserve"> </w:t>
-      </w:r>
-      <w:r>
-        <w:rPr>
-          <w:sz w:val="20"/>
-        </w:rPr>
-        <w:t>20</w:t>
-      </w:r>
-      <w:r>
-        <w:rPr>
-          <w:spacing w:val="-7"/>
-          <w:sz w:val="20"/>
-        </w:rPr>
-        <w:t xml:space="preserve"> </w:t>
-      </w:r>
-      <w:r>
-        <w:rPr>
-          <w:sz w:val="20"/>
-        </w:rPr>
-        <w:t>месяцев</w:t>
-      </w:r>
-      <w:r>
-        <w:rPr>
-          <w:spacing w:val="-6"/>
-          <w:sz w:val="20"/>
-        </w:rPr>
-        <w:t xml:space="preserve"> </w:t>
-      </w:r>
-      <w:r>
-        <w:rPr>
-          <w:sz w:val="20"/>
-        </w:rPr>
-        <w:t>с</w:t>
-      </w:r>
-      <w:r>
-        <w:rPr>
-          <w:spacing w:val="-6"/>
-          <w:sz w:val="20"/>
-        </w:rPr>
-        <w:t xml:space="preserve"> </w:t>
-      </w:r>
-      <w:r>
-        <w:rPr>
-          <w:sz w:val="20"/>
-        </w:rPr>
-        <w:t>даты</w:t>
-      </w:r>
-      <w:r>
-        <w:rPr>
-          <w:spacing w:val="-7"/>
-          <w:sz w:val="20"/>
-        </w:rPr>
-        <w:t xml:space="preserve"> </w:t>
-      </w:r>
-      <w:r>
-        <w:rPr>
-          <w:sz w:val="20"/>
-        </w:rPr>
-        <w:t>поставки</w:t>
-      </w:r>
-      <w:r>
-        <w:rPr>
-          <w:spacing w:val="-6"/>
-          <w:sz w:val="20"/>
-        </w:rPr>
-        <w:t xml:space="preserve"> </w:t>
-      </w:r>
-      <w:r>
-        <w:rPr>
-          <w:spacing w:val="-2"/>
-          <w:sz w:val="20"/>
-        </w:rPr>
-        <w:t>товара.</w:t>
+        <w:t>Гарантия на поставляемый товар составляет 20 месяцев с даты поставки товара.</w:t>
       </w:r>
     </w:p>
     <w:p>
@@ -5450,10 +3367,7 @@
           <w:p>
             <w:pPr>
               <w:pStyle w:val="TableParagraph"/>
-              <w:tabs>
-                <w:tab w:val="left" w:pos="2514"/>
-              </w:tabs>
-              <w:ind w:left="665" w:right="621" w:hanging="550"/>
+              <w:ind w:left="0"/>
               <w:rPr>
                 <w:sz w:val="20"/>
               </w:rPr>
@@ -5461,75 +3375,14 @@
             <w:r>
               <w:rPr>
                 <w:sz w:val="20"/>
-                <w:u w:val="single"/>
-              </w:rPr>
-              <w:tab/>
+              </w:rPr>
+              <w:t xml:space="preserve">      ____________________</w:t>
             </w:r>
             <w:r>
               <w:rPr>
                 <w:sz w:val="20"/>
-                <w:u w:val="single"/>
-              </w:rPr>
-              <w:tab/>
-            </w:r>
-            <w:r>
-              <w:rPr>
-                <w:spacing w:val="-9"/>
-                <w:sz w:val="20"/>
-              </w:rPr>
-              <w:t xml:space="preserve"> </w:t>
-            </w:r>
-            <w:r>
-              <w:rPr>
-                <w:sz w:val="20"/>
-              </w:rPr>
-              <w:t>/</w:t>
-            </w:r>
-            <w:r>
-              <w:rPr>
-                <w:spacing w:val="-10"/>
-                <w:sz w:val="20"/>
-              </w:rPr>
-              <w:t xml:space="preserve"> </w:t>
-            </w:r>
-            <w:r>
-              <w:rPr>
-                <w:sz w:val="20"/>
-              </w:rPr>
-              <w:t>Купорова</w:t>
-            </w:r>
-            <w:r>
-              <w:rPr>
-                <w:spacing w:val="-10"/>
-                <w:sz w:val="20"/>
-              </w:rPr>
-              <w:t xml:space="preserve"> </w:t>
-            </w:r>
-            <w:r>
-              <w:rPr>
-                <w:sz w:val="20"/>
-              </w:rPr>
-              <w:t>Е.</w:t>
-            </w:r>
-            <w:r>
-              <w:rPr>
-                <w:spacing w:val="-10"/>
-                <w:sz w:val="20"/>
-              </w:rPr>
-              <w:t xml:space="preserve"> </w:t>
-            </w:r>
-            <w:r>
-              <w:rPr>
-                <w:sz w:val="20"/>
-              </w:rPr>
-              <w:t xml:space="preserve">А. </w:t>
-            </w:r>
-            <w:r>
-              <w:rPr>
-                <w:spacing w:val="-4"/>
-                <w:sz w:val="20"/>
-              </w:rPr>
-              <w:t>М.П.</w:t>
+              </w:rPr>
+              <w:t xml:space="preserve"> ООО "ВЕРКУП"</w:t>
             </w:r>
           </w:p>
         </w:tc>
@@ -5549,10 +3402,7 @@
           <w:p>
             <w:pPr>
               <w:pStyle w:val="TableParagraph"/>
-              <w:tabs>
-                <w:tab w:val="left" w:pos="2409"/>
-              </w:tabs>
-              <w:ind w:left="659" w:right="1239" w:hanging="550"/>
+              <w:ind w:left="0"/>
               <w:rPr>
                 <w:sz w:val="20"/>
               </w:rPr>
@@ -5560,48 +3410,14 @@
             <w:r>
               <w:rPr>
                 <w:sz w:val="20"/>
-                <w:u w:val="single"/>
-              </w:rPr>
-              <w:tab/>
+              </w:rPr>
+              <w:t xml:space="preserve">     __________________</w:t>
             </w:r>
             <w:r>
               <w:rPr>
                 <w:sz w:val="20"/>
-                <w:u w:val="single"/>
-              </w:rPr>
-              <w:tab/>
-            </w:r>
-            <w:r>
-              <w:rPr>
-                <w:sz w:val="20"/>
-              </w:rPr>
-              <w:t>/</w:t>
-            </w:r>
-            <w:r>
-              <w:rPr>
-                <w:spacing w:val="-13"/>
-                <w:sz w:val="20"/>
-              </w:rPr>
-              <w:t xml:space="preserve"> </w:t>
-            </w:r>
-            <w:r>
-              <w:rPr>
-                <w:sz w:val="20"/>
-              </w:rPr>
-              <w:t>Зуев</w:t>
-            </w:r>
-            <w:r>
-              <w:rPr>
-                <w:spacing w:val="-12"/>
-                <w:sz w:val="20"/>
-              </w:rPr>
-              <w:t xml:space="preserve"> </w:t>
-            </w:r>
-            <w:r>
-              <w:rPr>
-                <w:sz w:val="20"/>
-              </w:rPr>
-              <w:t>О.А. М.П. / Подпись</w:t>
+              </w:rPr>
+              <w:t xml:space="preserve"> ООО "ИНТЕКТЕХНО"</w:t>
             </w:r>
           </w:p>
         </w:tc>
@@ -5641,123 +3457,10 @@
         <w:jc w:val="right"/>
       </w:pPr>
       <w:r>
-        <w:t>Приложение</w:t>
-      </w:r>
-      <w:r>
         <w:rPr>
           <w:spacing w:val="-13"/>
         </w:rPr>
-        <w:t xml:space="preserve"> </w:t>
-      </w:r>
-      <w:r>
-        <w:t>№1 К</w:t>
-      </w:r>
-      <w:r>
-        <w:rPr>
-          <w:spacing w:val="-7"/>
-        </w:rPr>
-        <w:t xml:space="preserve"> </w:t>
-      </w:r>
-      <w:r>
-        <w:t>Счет-договору</w:t>
-      </w:r>
-      <w:r>
-        <w:rPr>
-          <w:spacing w:val="-4"/>
-        </w:rPr>
-        <w:t xml:space="preserve"> </w:t>
-      </w:r>
-      <w:r>
-        <w:t>на</w:t>
-      </w:r>
-      <w:r>
-        <w:rPr>
-          <w:spacing w:val="-4"/>
-        </w:rPr>
-        <w:t xml:space="preserve"> </w:t>
-      </w:r>
-      <w:r>
-        <w:t>поставку</w:t>
-      </w:r>
-      <w:r>
-        <w:rPr>
-          <w:spacing w:val="-4"/>
-        </w:rPr>
-        <w:t xml:space="preserve"> </w:t>
-      </w:r>
-      <w:r>
-        <w:t>товара</w:t>
-      </w:r>
-      <w:r>
-        <w:rPr>
-          <w:spacing w:val="66"/>
-          <w:w w:val="150"/>
-        </w:rPr>
-        <w:t xml:space="preserve"> </w:t>
-      </w:r>
-      <w:r>
-        <w:rPr>
-          <w:b/>
-        </w:rPr>
-        <w:t>№</w:t>
-      </w:r>
-      <w:r>
-        <w:rPr>
-          <w:b/>
-          <w:spacing w:val="-5"/>
-        </w:rPr>
-        <w:t xml:space="preserve"> </w:t>
-      </w:r>
-      <w:r>
-        <w:t>6911</w:t>
-      </w:r>
-      <w:r>
-        <w:rPr>
-          <w:spacing w:val="-4"/>
-        </w:rPr>
-        <w:t xml:space="preserve"> </w:t>
-      </w:r>
-      <w:r>
-        <w:t>от</w:t>
-      </w:r>
-      <w:r>
-        <w:rPr>
-          <w:spacing w:val="-4"/>
-        </w:rPr>
-        <w:t xml:space="preserve"> </w:t>
-      </w:r>
-      <w:r>
-        <w:t>13</w:t>
-      </w:r>
-      <w:r>
-        <w:rPr>
-          <w:spacing w:val="-4"/>
-        </w:rPr>
-        <w:t xml:space="preserve"> </w:t>
-      </w:r>
-      <w:r>
-        <w:t>мая</w:t>
-      </w:r>
-      <w:r>
-        <w:rPr>
-          <w:spacing w:val="-4"/>
-        </w:rPr>
-        <w:t xml:space="preserve"> </w:t>
-      </w:r>
-      <w:r>
-        <w:t>2026</w:t>
-      </w:r>
-      <w:r>
-        <w:rPr>
-          <w:spacing w:val="-3"/>
-        </w:rPr>
-        <w:t xml:space="preserve"> </w:t>
-      </w:r>
-      <w:r>
-        <w:rPr>
-          <w:spacing w:val="-5"/>
-        </w:rPr>
-        <w:t>г.</w:t>
+        <w:t>Приложение №1 К Счет-договору на поставку товара № 16530 от 4 июнь 2026 г.</w:t>
       </w:r>
     </w:p>
     <w:p>
@@ -5791,102 +3494,6 @@
           <w:sz w:val="24"/>
         </w:rPr>
       </w:pPr>
-      <w:r>
-        <w:rPr>
-          <w:noProof/>
-        </w:rPr>
-        <w:drawing>
-          <wp:anchor distT="0" distB="0" distL="0" distR="0" simplePos="0" relativeHeight="251658240" behindDoc="0" locked="0" layoutInCell="1" allowOverlap="1" wp14:anchorId="7A94B096" wp14:editId="3547635A">
-            <wp:simplePos x="0" y="0"/>
-            <wp:positionH relativeFrom="page">
-              <wp:posOffset>2220592</wp:posOffset>
-            </wp:positionH>
-            <wp:positionV relativeFrom="paragraph">
-              <wp:posOffset>192306</wp:posOffset>
-            </wp:positionV>
-            <wp:extent cx="3214588" cy="2337720"/>
-            <wp:effectExtent l="0" t="0" r="0" b="0"/>
-            <wp:wrapTopAndBottom/>
-            <wp:docPr id="3" name="image8.jpeg"/>
-            <wp:cNvGraphicFramePr>
-              <a:graphicFrameLocks xmlns:a="http://schemas.openxmlformats.org/drawingml/2006/main" noChangeAspect="1"/>
-            </wp:cNvGraphicFramePr>
-            <a:graphic xmlns:a="http://schemas.openxmlformats.org/drawingml/2006/main">
-              <a:graphicData uri="http://schemas.openxmlformats.org/drawingml/2006/picture">
-                <pic:pic xmlns:pic="http://schemas.openxmlformats.org/drawingml/2006/picture">
-                  <pic:nvPicPr>
-                    <pic:cNvPr id="4" name="image8.jpeg"/>
-                    <pic:cNvPicPr/>
-                  </pic:nvPicPr>
-                  <pic:blipFill>
-                    <a:blip r:embed="rId9" cstate="print"/>
-                    <a:stretch>
-                      <a:fillRect/>
-                    </a:stretch>
-                  </pic:blipFill>
-                  <pic:spPr>
-                    <a:xfrm>
-                      <a:off x="0" y="0"/>
-                      <a:ext cx="3214588" cy="2337720"/>
-                    </a:xfrm>
-                    <a:prstGeom prst="rect">
-                      <a:avLst/>
-                    </a:prstGeom>
-                  </pic:spPr>
-                </pic:pic>
-              </a:graphicData>
-            </a:graphic>
-          </wp:anchor>
-        </w:drawing>
-      </w:r>
-      <w:r>
-        <w:rPr>
-          <w:noProof/>
-        </w:rPr>
-        <w:drawing>
-          <wp:anchor distT="0" distB="0" distL="0" distR="0" simplePos="0" relativeHeight="2" behindDoc="0" locked="0" layoutInCell="1" allowOverlap="1" wp14:anchorId="0EBB4D17" wp14:editId="42891338">
-            <wp:simplePos x="0" y="0"/>
-            <wp:positionH relativeFrom="page">
-              <wp:posOffset>947015</wp:posOffset>
-            </wp:positionH>
-            <wp:positionV relativeFrom="paragraph">
-              <wp:posOffset>2645134</wp:posOffset>
-            </wp:positionV>
-            <wp:extent cx="5631881" cy="1168146"/>
-            <wp:effectExtent l="0" t="0" r="0" b="0"/>
-            <wp:wrapTopAndBottom/>
-            <wp:docPr id="5" name="image9.jpeg"/>
-            <wp:cNvGraphicFramePr>
-              <a:graphicFrameLocks xmlns:a="http://schemas.openxmlformats.org/drawingml/2006/main" noChangeAspect="1"/>
-            </wp:cNvGraphicFramePr>
-            <a:graphic xmlns:a="http://schemas.openxmlformats.org/drawingml/2006/main">
-              <a:graphicData uri="http://schemas.openxmlformats.org/drawingml/2006/picture">
-                <pic:pic xmlns:pic="http://schemas.openxmlformats.org/drawingml/2006/picture">
-                  <pic:nvPicPr>
-                    <pic:cNvPr id="6" name="image9.jpeg"/>
-                    <pic:cNvPicPr/>
-                  </pic:nvPicPr>
-                  <pic:blipFill>
-                    <a:blip r:embed="rId10" cstate="print"/>
-                    <a:stretch>
-                      <a:fillRect/>
-                    </a:stretch>
-                  </pic:blipFill>
-                  <pic:spPr>
-                    <a:xfrm>
-                      <a:off x="0" y="0"/>
-                      <a:ext cx="5631881" cy="1168146"/>
-                    </a:xfrm>
-                    <a:prstGeom prst="rect">
-                      <a:avLst/>
-                    </a:prstGeom>
-                  </pic:spPr>
-                </pic:pic>
-              </a:graphicData>
-            </a:graphic>
-          </wp:anchor>
-        </w:drawing>
-      </w:r>
     </w:p>
     <w:p>
       <w:pPr>
@@ -5902,7 +3509,6 @@
       <w:pPr>
         <w:pStyle w:val="a3"/>
         <w:spacing w:before="149"/>
-        <w:ind w:left="400"/>
       </w:pPr>
       <w:r>
         <w:t>Описание</w:t>
@@ -5920,636 +3526,20 @@
         <w:t>конструкции:</w:t>
       </w:r>
     </w:p>
+    <w:p/>
+    <w:p/>
+    <w:p/>
+    <w:p>
+      <w:r>
+        <w:t xml:space="preserve">Интерьерная навигационная табличка с </w:t>
+      </w:r>
+      <w:r>
+        <w:t>печатью/аппликацией, защитным покрытием и креплением согласно согласованному макету.</w:t>
+      </w:r>
+    </w:p>
     <w:p>
       <w:pPr>
         <w:pStyle w:val="a3"/>
-        <w:spacing w:before="34"/>
-        <w:ind w:left="400"/>
-      </w:pPr>
-      <w:r>
-        <w:t>Световой</w:t>
-      </w:r>
-      <w:r>
-        <w:rPr>
-          <w:spacing w:val="-5"/>
-        </w:rPr>
-        <w:t xml:space="preserve"> </w:t>
-      </w:r>
-      <w:r>
-        <w:t>короб</w:t>
-      </w:r>
-      <w:r>
-        <w:rPr>
-          <w:spacing w:val="-5"/>
-        </w:rPr>
-        <w:t xml:space="preserve"> </w:t>
-      </w:r>
-      <w:r>
-        <w:t>с</w:t>
-      </w:r>
-      <w:r>
-        <w:rPr>
-          <w:spacing w:val="-5"/>
-        </w:rPr>
-        <w:t xml:space="preserve"> </w:t>
-      </w:r>
-      <w:r>
-        <w:rPr>
-          <w:spacing w:val="-2"/>
-        </w:rPr>
-        <w:t>инкрустацией</w:t>
-      </w:r>
-    </w:p>
-    <w:p>
-      <w:pPr>
-        <w:pStyle w:val="a3"/>
-        <w:spacing w:before="34" w:line="276" w:lineRule="auto"/>
-        <w:ind w:left="400" w:right="1203"/>
-      </w:pPr>
-      <w:r>
-        <w:t>Объемный</w:t>
-      </w:r>
-      <w:r>
-        <w:rPr>
-          <w:spacing w:val="-4"/>
-        </w:rPr>
-        <w:t xml:space="preserve"> </w:t>
-      </w:r>
-      <w:r>
-        <w:t>короб</w:t>
-      </w:r>
-      <w:r>
-        <w:rPr>
-          <w:spacing w:val="-4"/>
-        </w:rPr>
-        <w:t xml:space="preserve"> </w:t>
-      </w:r>
-      <w:r>
-        <w:t>из</w:t>
-      </w:r>
-      <w:r>
-        <w:rPr>
-          <w:spacing w:val="-4"/>
-        </w:rPr>
-        <w:t xml:space="preserve"> </w:t>
-      </w:r>
-      <w:r>
-        <w:t>алюминиевой</w:t>
-      </w:r>
-      <w:r>
-        <w:rPr>
-          <w:spacing w:val="-4"/>
-        </w:rPr>
-        <w:t xml:space="preserve"> </w:t>
-      </w:r>
-      <w:r>
-        <w:t>композитной</w:t>
-      </w:r>
-      <w:r>
-        <w:rPr>
-          <w:spacing w:val="-4"/>
-        </w:rPr>
-        <w:t xml:space="preserve"> </w:t>
-      </w:r>
-      <w:r>
-        <w:t>панели</w:t>
-      </w:r>
-      <w:r>
-        <w:rPr>
-          <w:spacing w:val="-4"/>
-        </w:rPr>
-        <w:t xml:space="preserve"> </w:t>
-      </w:r>
-      <w:r>
-        <w:t>3мм</w:t>
-      </w:r>
-      <w:r>
-        <w:rPr>
-          <w:spacing w:val="-5"/>
-        </w:rPr>
-        <w:t xml:space="preserve"> </w:t>
-      </w:r>
-      <w:r>
-        <w:t>(цвет</w:t>
-      </w:r>
-      <w:r>
-        <w:rPr>
-          <w:spacing w:val="-4"/>
-        </w:rPr>
-        <w:t xml:space="preserve"> </w:t>
-      </w:r>
-      <w:r>
-        <w:t>согласовывается</w:t>
-      </w:r>
-      <w:r>
-        <w:rPr>
-          <w:spacing w:val="-4"/>
-        </w:rPr>
-        <w:t xml:space="preserve"> </w:t>
-      </w:r>
-      <w:r>
-        <w:t>с</w:t>
-      </w:r>
-      <w:r>
-        <w:rPr>
-          <w:spacing w:val="-4"/>
-        </w:rPr>
-        <w:t xml:space="preserve"> </w:t>
-      </w:r>
-      <w:r>
-        <w:t xml:space="preserve">Заказчиком) Инкрустация оргстеклом 4мм, оклеенным пленкой </w:t>
-      </w:r>
-      <w:proofErr w:type="spellStart"/>
-      <w:r>
-        <w:t>Oracal</w:t>
-      </w:r>
-      <w:proofErr w:type="spellEnd"/>
-      <w:r>
-        <w:t xml:space="preserve"> в два цвета</w:t>
-      </w:r>
-    </w:p>
-    <w:p>
-      <w:pPr>
-        <w:pStyle w:val="a3"/>
-        <w:spacing w:line="280" w:lineRule="auto"/>
-        <w:ind w:left="400" w:right="2153"/>
-      </w:pPr>
-      <w:r>
-        <w:t>Задник</w:t>
-      </w:r>
-      <w:r>
-        <w:rPr>
-          <w:spacing w:val="-4"/>
-        </w:rPr>
-        <w:t xml:space="preserve"> </w:t>
-      </w:r>
-      <w:r>
-        <w:t>–</w:t>
-      </w:r>
-      <w:r>
-        <w:rPr>
-          <w:spacing w:val="-4"/>
-        </w:rPr>
-        <w:t xml:space="preserve"> </w:t>
-      </w:r>
-      <w:proofErr w:type="spellStart"/>
-      <w:r>
-        <w:t>алюмииевая</w:t>
-      </w:r>
-      <w:proofErr w:type="spellEnd"/>
-      <w:r>
-        <w:rPr>
-          <w:spacing w:val="-4"/>
-        </w:rPr>
-        <w:t xml:space="preserve"> </w:t>
-      </w:r>
-      <w:r>
-        <w:t>композитная</w:t>
-      </w:r>
-      <w:r>
-        <w:rPr>
-          <w:spacing w:val="-4"/>
-        </w:rPr>
-        <w:t xml:space="preserve"> </w:t>
-      </w:r>
-      <w:r>
-        <w:t>панель</w:t>
-      </w:r>
-      <w:r>
-        <w:rPr>
-          <w:spacing w:val="-4"/>
-        </w:rPr>
-        <w:t xml:space="preserve"> </w:t>
-      </w:r>
-      <w:r>
-        <w:t>3мм</w:t>
-      </w:r>
-      <w:r>
-        <w:rPr>
-          <w:spacing w:val="-4"/>
-        </w:rPr>
-        <w:t xml:space="preserve"> </w:t>
-      </w:r>
-      <w:r>
-        <w:t>(цвет</w:t>
-      </w:r>
-      <w:r>
-        <w:rPr>
-          <w:spacing w:val="-4"/>
-        </w:rPr>
-        <w:t xml:space="preserve"> </w:t>
-      </w:r>
-      <w:proofErr w:type="spellStart"/>
-      <w:r>
-        <w:t>согласовываетс</w:t>
-      </w:r>
-      <w:proofErr w:type="spellEnd"/>
-      <w:r>
-        <w:rPr>
-          <w:spacing w:val="-4"/>
-        </w:rPr>
-        <w:t xml:space="preserve"> </w:t>
-      </w:r>
-      <w:r>
-        <w:t>с</w:t>
-      </w:r>
-      <w:r>
-        <w:rPr>
-          <w:spacing w:val="-4"/>
-        </w:rPr>
-        <w:t xml:space="preserve"> </w:t>
-      </w:r>
-      <w:r>
-        <w:t>Заказчиком) Глубина 80-90 мм.</w:t>
-      </w:r>
-    </w:p>
-    <w:p>
-      <w:pPr>
-        <w:pStyle w:val="a3"/>
-        <w:spacing w:line="276" w:lineRule="auto"/>
-        <w:ind w:left="400" w:right="3823"/>
-      </w:pPr>
-      <w:r>
-        <w:t>Подсветка</w:t>
-      </w:r>
-      <w:r>
-        <w:rPr>
-          <w:spacing w:val="-6"/>
-        </w:rPr>
-        <w:t xml:space="preserve"> </w:t>
-      </w:r>
-      <w:r>
-        <w:t>–</w:t>
-      </w:r>
-      <w:r>
-        <w:rPr>
-          <w:spacing w:val="-6"/>
-        </w:rPr>
-        <w:t xml:space="preserve"> </w:t>
-      </w:r>
-      <w:r>
-        <w:t>светодиодные</w:t>
-      </w:r>
-      <w:r>
-        <w:rPr>
-          <w:spacing w:val="-6"/>
-        </w:rPr>
-        <w:t xml:space="preserve"> </w:t>
-      </w:r>
-      <w:r>
-        <w:t>модули</w:t>
-      </w:r>
-      <w:r>
-        <w:rPr>
-          <w:spacing w:val="-6"/>
-        </w:rPr>
-        <w:t xml:space="preserve"> </w:t>
-      </w:r>
-      <w:r>
-        <w:t>(IP</w:t>
-      </w:r>
-      <w:r>
-        <w:rPr>
-          <w:spacing w:val="-6"/>
-        </w:rPr>
-        <w:t xml:space="preserve"> </w:t>
-      </w:r>
-      <w:r>
-        <w:t>65-67)</w:t>
-      </w:r>
-      <w:r>
-        <w:rPr>
-          <w:spacing w:val="-6"/>
-        </w:rPr>
-        <w:t xml:space="preserve"> </w:t>
-      </w:r>
-      <w:r>
-        <w:t>повышенной</w:t>
-      </w:r>
-      <w:r>
-        <w:rPr>
-          <w:spacing w:val="-6"/>
-        </w:rPr>
-        <w:t xml:space="preserve"> </w:t>
-      </w:r>
-      <w:r>
-        <w:t>яркости. Блок питания – трансформатор (Пыле-Влагостойкий) IP65-67.</w:t>
-      </w:r>
-    </w:p>
-    <w:p>
-      <w:pPr>
-        <w:pStyle w:val="a3"/>
-        <w:spacing w:line="229" w:lineRule="exact"/>
-        <w:ind w:left="400"/>
-      </w:pPr>
-      <w:r>
-        <w:t>Подложка</w:t>
-      </w:r>
-      <w:r>
-        <w:rPr>
-          <w:spacing w:val="-11"/>
-        </w:rPr>
-        <w:t xml:space="preserve"> </w:t>
-      </w:r>
-      <w:r>
-        <w:t>АКП</w:t>
-      </w:r>
-      <w:r>
-        <w:rPr>
-          <w:spacing w:val="-11"/>
-        </w:rPr>
-        <w:t xml:space="preserve"> </w:t>
-      </w:r>
-      <w:r>
-        <w:t>(</w:t>
-      </w:r>
-      <w:proofErr w:type="spellStart"/>
-      <w:r>
-        <w:t>алюмокомпозитная</w:t>
-      </w:r>
-      <w:proofErr w:type="spellEnd"/>
-      <w:r>
-        <w:rPr>
-          <w:spacing w:val="-11"/>
-        </w:rPr>
-        <w:t xml:space="preserve"> </w:t>
-      </w:r>
-      <w:r>
-        <w:t>панель)</w:t>
-      </w:r>
-      <w:r>
-        <w:rPr>
-          <w:spacing w:val="-10"/>
-        </w:rPr>
-        <w:t xml:space="preserve"> </w:t>
-      </w:r>
-      <w:r>
-        <w:rPr>
-          <w:spacing w:val="-5"/>
-        </w:rPr>
-        <w:t>3мм</w:t>
-      </w:r>
-    </w:p>
-    <w:p>
-      <w:pPr>
-        <w:pStyle w:val="a3"/>
-        <w:spacing w:before="28"/>
-        <w:ind w:left="400"/>
-      </w:pPr>
-      <w:r>
-        <w:t>Вывод</w:t>
-      </w:r>
-      <w:r>
-        <w:rPr>
-          <w:spacing w:val="-7"/>
-        </w:rPr>
-        <w:t xml:space="preserve"> </w:t>
-      </w:r>
-      <w:r>
-        <w:t>провода</w:t>
-      </w:r>
-      <w:r>
-        <w:rPr>
-          <w:spacing w:val="-6"/>
-        </w:rPr>
-        <w:t xml:space="preserve"> </w:t>
-      </w:r>
-      <w:r>
-        <w:t>от</w:t>
-      </w:r>
-      <w:r>
-        <w:rPr>
-          <w:spacing w:val="-6"/>
-        </w:rPr>
-        <w:t xml:space="preserve"> </w:t>
-      </w:r>
-      <w:r>
-        <w:t>конструкции</w:t>
-      </w:r>
-      <w:r>
-        <w:rPr>
-          <w:spacing w:val="-6"/>
-        </w:rPr>
-        <w:t xml:space="preserve"> </w:t>
-      </w:r>
-      <w:r>
-        <w:t>на</w:t>
-      </w:r>
-      <w:r>
-        <w:rPr>
-          <w:spacing w:val="-6"/>
-        </w:rPr>
-        <w:t xml:space="preserve"> </w:t>
-      </w:r>
-      <w:r>
-        <w:t>3000мм.</w:t>
-      </w:r>
-      <w:r>
-        <w:rPr>
-          <w:spacing w:val="-6"/>
-        </w:rPr>
-        <w:t xml:space="preserve"> </w:t>
-      </w:r>
-      <w:r>
-        <w:t>Подключение</w:t>
-      </w:r>
-      <w:r>
-        <w:rPr>
-          <w:spacing w:val="-6"/>
-        </w:rPr>
-        <w:t xml:space="preserve"> </w:t>
-      </w:r>
-      <w:r>
-        <w:t>к</w:t>
-      </w:r>
-      <w:r>
-        <w:rPr>
-          <w:spacing w:val="-6"/>
-        </w:rPr>
-        <w:t xml:space="preserve"> </w:t>
-      </w:r>
-      <w:r>
-        <w:t>220В</w:t>
-      </w:r>
-      <w:r>
-        <w:rPr>
-          <w:spacing w:val="-7"/>
-        </w:rPr>
-        <w:t xml:space="preserve"> </w:t>
-      </w:r>
-      <w:r>
-        <w:t>через</w:t>
-      </w:r>
-      <w:r>
-        <w:rPr>
-          <w:spacing w:val="-6"/>
-        </w:rPr>
-        <w:t xml:space="preserve"> </w:t>
-      </w:r>
-      <w:r>
-        <w:rPr>
-          <w:spacing w:val="-4"/>
-        </w:rPr>
-        <w:t>блок</w:t>
-      </w:r>
-    </w:p>
-    <w:p>
-      <w:pPr>
-        <w:pStyle w:val="a3"/>
-        <w:spacing w:before="34" w:line="276" w:lineRule="auto"/>
-        <w:ind w:left="400" w:right="1203"/>
-      </w:pPr>
-      <w:r>
-        <w:t>Протяжка</w:t>
-      </w:r>
-      <w:r>
-        <w:rPr>
-          <w:spacing w:val="-3"/>
-        </w:rPr>
-        <w:t xml:space="preserve"> </w:t>
-      </w:r>
-      <w:r>
-        <w:t>кабеля</w:t>
-      </w:r>
-      <w:r>
-        <w:rPr>
-          <w:spacing w:val="-3"/>
-        </w:rPr>
-        <w:t xml:space="preserve"> </w:t>
-      </w:r>
-      <w:r>
-        <w:t>по</w:t>
-      </w:r>
-      <w:r>
-        <w:rPr>
-          <w:spacing w:val="-3"/>
-        </w:rPr>
-        <w:t xml:space="preserve"> </w:t>
-      </w:r>
-      <w:r>
-        <w:t>фасаду</w:t>
-      </w:r>
-      <w:r>
-        <w:rPr>
-          <w:spacing w:val="-3"/>
-        </w:rPr>
-        <w:t xml:space="preserve"> </w:t>
-      </w:r>
-      <w:r>
-        <w:t>более</w:t>
-      </w:r>
-      <w:r>
-        <w:rPr>
-          <w:spacing w:val="-3"/>
-        </w:rPr>
-        <w:t xml:space="preserve"> </w:t>
-      </w:r>
-      <w:r>
-        <w:t>3</w:t>
-      </w:r>
-      <w:r>
-        <w:rPr>
-          <w:spacing w:val="-3"/>
-        </w:rPr>
-        <w:t xml:space="preserve"> </w:t>
-      </w:r>
-      <w:r>
-        <w:t>(Три)</w:t>
-      </w:r>
-      <w:r>
-        <w:rPr>
-          <w:spacing w:val="-3"/>
-        </w:rPr>
-        <w:t xml:space="preserve"> </w:t>
-      </w:r>
-      <w:r>
-        <w:t>метров,</w:t>
-      </w:r>
-      <w:r>
-        <w:rPr>
-          <w:spacing w:val="-3"/>
-        </w:rPr>
-        <w:t xml:space="preserve"> </w:t>
-      </w:r>
-      <w:r>
-        <w:t>завод</w:t>
-      </w:r>
-      <w:r>
-        <w:rPr>
-          <w:spacing w:val="-3"/>
-        </w:rPr>
-        <w:t xml:space="preserve"> </w:t>
-      </w:r>
-      <w:r>
-        <w:t>кабеля</w:t>
-      </w:r>
-      <w:r>
-        <w:rPr>
-          <w:spacing w:val="-3"/>
-        </w:rPr>
-        <w:t xml:space="preserve"> </w:t>
-      </w:r>
-      <w:r>
-        <w:t>в</w:t>
-      </w:r>
-      <w:r>
-        <w:rPr>
-          <w:spacing w:val="-3"/>
-        </w:rPr>
-        <w:t xml:space="preserve"> </w:t>
-      </w:r>
-      <w:r>
-        <w:t>помещение</w:t>
-      </w:r>
-      <w:r>
-        <w:rPr>
-          <w:spacing w:val="-3"/>
-        </w:rPr>
-        <w:t xml:space="preserve"> </w:t>
-      </w:r>
-      <w:r>
-        <w:t>и</w:t>
-      </w:r>
-      <w:r>
-        <w:rPr>
-          <w:spacing w:val="-3"/>
-        </w:rPr>
-        <w:t xml:space="preserve"> </w:t>
-      </w:r>
-      <w:r>
-        <w:t>протяжка</w:t>
-      </w:r>
-      <w:r>
-        <w:rPr>
-          <w:spacing w:val="-3"/>
-        </w:rPr>
-        <w:t xml:space="preserve"> </w:t>
-      </w:r>
-      <w:r>
-        <w:t>кабеля</w:t>
-      </w:r>
-      <w:r>
-        <w:rPr>
-          <w:spacing w:val="-3"/>
-        </w:rPr>
-        <w:t xml:space="preserve"> </w:t>
-      </w:r>
-      <w:r>
-        <w:t>в помещении в монтаже не учитываются, так как являются дополнительными работами.</w:t>
-      </w:r>
-    </w:p>
-    <w:p>
-      <w:pPr>
-        <w:pStyle w:val="a3"/>
-      </w:pPr>
-    </w:p>
-    <w:p>
-      <w:pPr>
-        <w:pStyle w:val="a3"/>
-        <w:spacing w:before="9"/>
-        <w:rPr>
-          <w:sz w:val="25"/>
-        </w:rPr>
       </w:pPr>
     </w:p>
     <w:tbl>
@@ -6641,10 +3631,7 @@
           <w:p>
             <w:pPr>
               <w:pStyle w:val="TableParagraph"/>
-              <w:tabs>
-                <w:tab w:val="left" w:pos="2514"/>
-              </w:tabs>
-              <w:ind w:left="665" w:right="621" w:hanging="550"/>
+              <w:ind w:left="0"/>
               <w:rPr>
                 <w:sz w:val="20"/>
               </w:rPr>
@@ -6652,75 +3639,8 @@
             <w:r>
               <w:rPr>
                 <w:sz w:val="20"/>
-                <w:u w:val="single"/>
-              </w:rPr>
-              <w:tab/>
-            </w:r>
-            <w:r>
-              <w:rPr>
-                <w:sz w:val="20"/>
-                <w:u w:val="single"/>
-              </w:rPr>
-              <w:tab/>
-            </w:r>
-            <w:r>
-              <w:rPr>
-                <w:spacing w:val="-9"/>
-                <w:sz w:val="20"/>
-              </w:rPr>
-              <w:t xml:space="preserve"> </w:t>
-            </w:r>
-            <w:r>
-              <w:rPr>
-                <w:sz w:val="20"/>
-              </w:rPr>
-              <w:t>/</w:t>
-            </w:r>
-            <w:r>
-              <w:rPr>
-                <w:spacing w:val="-10"/>
-                <w:sz w:val="20"/>
-              </w:rPr>
-              <w:t xml:space="preserve"> </w:t>
-            </w:r>
-            <w:r>
-              <w:rPr>
-                <w:sz w:val="20"/>
-              </w:rPr>
-              <w:t>Купорова</w:t>
-            </w:r>
-            <w:r>
-              <w:rPr>
-                <w:spacing w:val="-10"/>
-                <w:sz w:val="20"/>
-              </w:rPr>
-              <w:t xml:space="preserve"> </w:t>
-            </w:r>
-            <w:r>
-              <w:rPr>
-                <w:sz w:val="20"/>
-              </w:rPr>
-              <w:t>Е.</w:t>
-            </w:r>
-            <w:r>
-              <w:rPr>
-                <w:spacing w:val="-10"/>
-                <w:sz w:val="20"/>
-              </w:rPr>
-              <w:t xml:space="preserve"> </w:t>
-            </w:r>
-            <w:r>
-              <w:rPr>
-                <w:sz w:val="20"/>
-              </w:rPr>
-              <w:t xml:space="preserve">А. </w:t>
-            </w:r>
-            <w:r>
-              <w:rPr>
-                <w:spacing w:val="-4"/>
-                <w:sz w:val="20"/>
-              </w:rPr>
-              <w:t>М.П.</w:t>
+              </w:rPr>
+              <w:t xml:space="preserve">      ____________________ ООО "ВЕРКУП"</w:t>
             </w:r>
           </w:p>
         </w:tc>
@@ -6740,10 +3660,7 @@
           <w:p>
             <w:pPr>
               <w:pStyle w:val="TableParagraph"/>
-              <w:tabs>
-                <w:tab w:val="left" w:pos="2409"/>
-              </w:tabs>
-              <w:ind w:left="659" w:right="842" w:hanging="550"/>
+              <w:ind w:left="0"/>
               <w:rPr>
                 <w:sz w:val="20"/>
               </w:rPr>
@@ -6751,43 +3668,8 @@
             <w:r>
               <w:rPr>
                 <w:sz w:val="20"/>
-                <w:u w:val="single"/>
-              </w:rPr>
-              <w:tab/>
-            </w:r>
-            <w:r>
-              <w:rPr>
-                <w:sz w:val="20"/>
-                <w:u w:val="single"/>
-              </w:rPr>
-              <w:tab/>
-            </w:r>
-            <w:r>
-              <w:rPr>
-                <w:sz w:val="20"/>
-              </w:rPr>
-              <w:t>/</w:t>
-            </w:r>
-            <w:proofErr w:type="spellStart"/>
-            <w:r>
-              <w:rPr>
-                <w:sz w:val="20"/>
-              </w:rPr>
-              <w:t>Раджапов</w:t>
-            </w:r>
-            <w:proofErr w:type="spellEnd"/>
-            <w:r>
-              <w:rPr>
-                <w:spacing w:val="-13"/>
-                <w:sz w:val="20"/>
-              </w:rPr>
-              <w:t xml:space="preserve"> </w:t>
-            </w:r>
-            <w:r>
-              <w:rPr>
-                <w:sz w:val="20"/>
-              </w:rPr>
-              <w:t>Р.М. М.П. / Подпись</w:t>
+              </w:rPr>
+              <w:t xml:space="preserve">     __________________ ООО "ИНТЕКТЕХНО"</w:t>
             </w:r>
           </w:p>
         </w:tc>
@@ -6857,7 +3739,7 @@
         <w:noProof/>
       </w:rPr>
       <w:drawing>
-        <wp:anchor distT="0" distB="0" distL="114300" distR="114300" simplePos="0" relativeHeight="487365120" behindDoc="0" locked="0" layoutInCell="1" allowOverlap="1" wp14:anchorId="7A938FBC" wp14:editId="513A9D4C">
+        <wp:anchor distT="0" distB="0" distL="114300" distR="114300" simplePos="0" relativeHeight="487365120" behindDoc="0" locked="0" layoutInCell="1" allowOverlap="1" wp14:anchorId="25C559D9" wp14:editId="1F1493FB">
           <wp:simplePos x="0" y="0"/>
           <wp:positionH relativeFrom="column">
             <wp:posOffset>317839</wp:posOffset>
@@ -6913,191 +3795,514 @@
       </w:drawing>
     </w:r>
     <w:r>
-      <w:pict w14:anchorId="28379AAF">
-        <v:shapetype id="_x0000_t202" coordsize="21600,21600" o:spt="202" path="m,l,21600r21600,l21600,xe">
-          <v:stroke joinstyle="miter"/>
-          <v:path gradientshapeok="t" o:connecttype="rect"/>
-        </v:shapetype>
-        <v:shape id="docshape1" o:spid="_x0000_s2050" type="#_x0000_t202" style="position:absolute;margin-left:228pt;margin-top:17.35pt;width:96.5pt;height:24.75pt;z-index:-15952896;mso-position-horizontal-relative:page;mso-position-vertical-relative:page" filled="f" stroked="f">
-          <v:textbox style="mso-next-textbox:#docshape1" inset="0,0,0,0">
-            <w:txbxContent>
-              <w:p>
-                <w:pPr>
-                  <w:spacing w:before="1"/>
-                  <w:ind w:left="12" w:right="11"/>
-                  <w:jc w:val="center"/>
-                  <w:rPr>
-                    <w:rFonts w:ascii="Arial"/>
-                    <w:b/>
-                    <w:sz w:val="18"/>
-                  </w:rPr>
-                </w:pPr>
-                <w:r>
-                  <w:rPr>
-                    <w:rFonts w:ascii="Arial"/>
-                    <w:b/>
-                  </w:rPr>
-                  <w:t>+7 495 275-30-80</w:t>
-                </w:r>
-                <w:r>
-                  <w:rPr>
-                    <w:rFonts w:ascii="Arial"/>
-                    <w:b/>
-                  </w:rPr>
-                  <w:br/>
-                </w:r>
-                <w:hyperlink r:id="rId2">
-                  <w:r>
-                    <w:rPr>
-                      <w:rFonts w:ascii="Arial"/>
-                      <w:b/>
-                      <w:spacing w:val="-2"/>
-                      <w:sz w:val="18"/>
-                    </w:rPr>
-                    <w:t>zakaz@verkup.ru</w:t>
-                  </w:r>
-                </w:hyperlink>
-              </w:p>
-            </w:txbxContent>
-          </v:textbox>
-          <w10:wrap anchorx="page" anchory="page"/>
-        </v:shape>
-      </w:pict>
+      <w:rPr>
+        <w:noProof/>
+      </w:rPr>
+      <mc:AlternateContent>
+        <mc:Choice Requires="wps">
+          <w:drawing>
+            <wp:anchor distT="0" distB="0" distL="114300" distR="114300" simplePos="0" relativeHeight="487363584" behindDoc="1" locked="0" layoutInCell="1" allowOverlap="1" wp14:anchorId="737DB5DC" wp14:editId="73F6F7FA">
+              <wp:simplePos x="0" y="0"/>
+              <wp:positionH relativeFrom="page">
+                <wp:posOffset>2895600</wp:posOffset>
+              </wp:positionH>
+              <wp:positionV relativeFrom="page">
+                <wp:posOffset>220345</wp:posOffset>
+              </wp:positionV>
+              <wp:extent cx="1225550" cy="314325"/>
+              <wp:effectExtent l="0" t="0" r="0" b="0"/>
+              <wp:wrapNone/>
+              <wp:docPr id="4" name="docshape1"/>
+              <wp:cNvGraphicFramePr>
+                <a:graphicFrameLocks xmlns:a="http://schemas.openxmlformats.org/drawingml/2006/main"/>
+              </wp:cNvGraphicFramePr>
+              <a:graphic xmlns:a="http://schemas.openxmlformats.org/drawingml/2006/main">
+                <a:graphicData uri="http://schemas.microsoft.com/office/word/2010/wordprocessingShape">
+                  <wps:wsp>
+                    <wps:cNvSpPr txBox="1">
+                      <a:spLocks noChangeArrowheads="1"/>
+                    </wps:cNvSpPr>
+                    <wps:spPr bwMode="auto">
+                      <a:xfrm>
+                        <a:off x="0" y="0"/>
+                        <a:ext cx="1225550" cy="314325"/>
+                      </a:xfrm>
+                      <a:prstGeom prst="rect">
+                        <a:avLst/>
+                      </a:prstGeom>
+                      <a:noFill/>
+                      <a:ln>
+                        <a:noFill/>
+                      </a:ln>
+                      <a:extLst>
+                        <a:ext uri="{909E8E84-426E-40DD-AFC4-6F175D3DCCD1}">
+                          <a14:hiddenFill xmlns:a14="http://schemas.microsoft.com/office/drawing/2010/main">
+                            <a:solidFill>
+                              <a:srgbClr val="FFFFFF"/>
+                            </a:solidFill>
+                          </a14:hiddenFill>
+                        </a:ext>
+                        <a:ext uri="{91240B29-F687-4F45-9708-019B960494DF}">
+                          <a14:hiddenLine xmlns:a14="http://schemas.microsoft.com/office/drawing/2010/main" w="9525">
+                            <a:solidFill>
+                              <a:srgbClr val="000000"/>
+                            </a:solidFill>
+                            <a:miter lim="800000"/>
+                            <a:headEnd/>
+                            <a:tailEnd/>
+                          </a14:hiddenLine>
+                        </a:ext>
+                      </a:extLst>
+                    </wps:spPr>
+                    <wps:txbx>
+                      <w:txbxContent>
+                        <w:p>
+                          <w:pPr>
+                            <w:spacing w:before="1"/>
+                            <w:ind w:left="12" w:right="11"/>
+                            <w:jc w:val="center"/>
+                            <w:rPr>
+                              <w:rFonts w:ascii="Arial"/>
+                              <w:b/>
+                              <w:sz w:val="18"/>
+                            </w:rPr>
+                          </w:pPr>
+                          <w:r>
+                            <w:rPr>
+                              <w:rFonts w:ascii="Arial"/>
+                              <w:b/>
+                            </w:rPr>
+                            <w:t>+7 495 275-30-80</w:t>
+                          </w:r>
+                          <w:r>
+                            <w:rPr>
+                              <w:rFonts w:ascii="Arial"/>
+                              <w:b/>
+                            </w:rPr>
+                            <w:br/>
+                          </w:r>
+                          <w:hyperlink r:id="rId2">
+                            <w:r>
+                              <w:rPr>
+                                <w:rFonts w:ascii="Arial"/>
+                                <w:b/>
+                                <w:spacing w:val="-2"/>
+                                <w:sz w:val="18"/>
+                              </w:rPr>
+                              <w:t>zakaz@verkup.ru</w:t>
+                            </w:r>
+                          </w:hyperlink>
+                        </w:p>
+                      </w:txbxContent>
+                    </wps:txbx>
+                    <wps:bodyPr rot="0" vert="horz" wrap="square" lIns="0" tIns="0" rIns="0" bIns="0" anchor="t" anchorCtr="0" upright="1">
+                      <a:noAutofit/>
+                    </wps:bodyPr>
+                  </wps:wsp>
+                </a:graphicData>
+              </a:graphic>
+              <wp14:sizeRelH relativeFrom="page">
+                <wp14:pctWidth>0</wp14:pctWidth>
+              </wp14:sizeRelH>
+              <wp14:sizeRelV relativeFrom="page">
+                <wp14:pctHeight>0</wp14:pctHeight>
+              </wp14:sizeRelV>
+            </wp:anchor>
+          </w:drawing>
+        </mc:Choice>
+        <mc:Fallback>
+          <w:pict>
+            <v:shapetype w14:anchorId="737DB5DC" id="_x0000_t202" coordsize="21600,21600" o:spt="202" path="m,l,21600r21600,l21600,xe">
+              <v:stroke joinstyle="miter"/>
+              <v:path gradientshapeok="t" o:connecttype="rect"/>
+            </v:shapetype>
+            <v:shape id="docshape1" o:spid="_x0000_s1026" type="#_x0000_t202" style="position:absolute;margin-left:228pt;margin-top:17.35pt;width:96.5pt;height:24.75pt;z-index:-15952896;visibility:visible;mso-wrap-style:square;mso-width-percent:0;mso-height-percent:0;mso-wrap-distance-left:9pt;mso-wrap-distance-top:0;mso-wrap-distance-right:9pt;mso-wrap-distance-bottom:0;mso-position-horizontal:absolute;mso-position-horizontal-relative:page;mso-position-vertical:absolute;mso-position-vertical-relative:page;mso-width-percent:0;mso-height-percent:0;mso-width-relative:page;mso-height-relative:page;v-text-anchor:top" o:gfxdata="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" filled="f" stroked="f">
+              <v:textbox inset="0,0,0,0">
+                <w:txbxContent>
+                  <w:p>
+                    <w:pPr>
+                      <w:spacing w:before="1"/>
+                      <w:ind w:left="12" w:right="11"/>
+                      <w:jc w:val="center"/>
+                      <w:rPr>
+                        <w:rFonts w:ascii="Arial"/>
+                        <w:b/>
+                        <w:sz w:val="18"/>
+                      </w:rPr>
+                    </w:pPr>
+                    <w:r>
+                      <w:rPr>
+                        <w:rFonts w:ascii="Arial"/>
+                        <w:b/>
+                      </w:rPr>
+                      <w:t>+7 495 275-30-80</w:t>
+                    </w:r>
+                    <w:r>
+                      <w:rPr>
+                        <w:rFonts w:ascii="Arial"/>
+                        <w:b/>
+                      </w:rPr>
+                      <w:br/>
+                    </w:r>
+                    <w:hyperlink r:id="rId3">
+                      <w:r>
+                        <w:rPr>
+                          <w:rFonts w:ascii="Arial"/>
+                          <w:b/>
+                          <w:spacing w:val="-2"/>
+                          <w:sz w:val="18"/>
+                        </w:rPr>
+                        <w:t>zakaz@verkup.ru</w:t>
+                      </w:r>
+                    </w:hyperlink>
+                  </w:p>
+                </w:txbxContent>
+              </v:textbox>
+              <w10:wrap anchorx="page" anchory="page"/>
+            </v:shape>
+          </w:pict>
+        </mc:Fallback>
+      </mc:AlternateContent>
     </w:r>
     <w:r>
-      <w:pict w14:anchorId="7835EEEF">
-        <v:shape id="docshape2" o:spid="_x0000_s2049" type="#_x0000_t202" style="position:absolute;margin-left:366.85pt;margin-top:21.85pt;width:132.6pt;height:20pt;z-index:-15952384;mso-position-horizontal-relative:page;mso-position-vertical-relative:page" filled="f" stroked="f">
-          <v:textbox style="mso-next-textbox:#docshape2" inset="0,0,0,0">
-            <w:txbxContent>
-              <w:p>
-                <w:pPr>
-                  <w:spacing w:before="13"/>
-                  <w:ind w:left="486" w:hanging="467"/>
-                  <w:rPr>
-                    <w:rFonts w:ascii="Arial" w:hAnsi="Arial"/>
-                    <w:b/>
-                    <w:sz w:val="16"/>
-                  </w:rPr>
-                </w:pPr>
-                <w:r>
-                  <w:rPr>
-                    <w:rFonts w:ascii="Arial" w:hAnsi="Arial"/>
-                    <w:b/>
-                    <w:sz w:val="16"/>
-                  </w:rPr>
-                  <w:t>Москва,</w:t>
-                </w:r>
-                <w:r>
-                  <w:rPr>
-                    <w:rFonts w:ascii="Arial" w:hAnsi="Arial"/>
-                    <w:b/>
-                    <w:spacing w:val="-8"/>
-                    <w:sz w:val="16"/>
-                  </w:rPr>
-                  <w:t xml:space="preserve"> </w:t>
-                </w:r>
-                <w:r>
-                  <w:rPr>
-                    <w:rFonts w:ascii="Arial" w:hAnsi="Arial"/>
-                    <w:b/>
-                    <w:sz w:val="16"/>
-                  </w:rPr>
-                  <w:t>ул.</w:t>
-                </w:r>
-                <w:r>
-                  <w:rPr>
-                    <w:rFonts w:ascii="Arial" w:hAnsi="Arial"/>
-                    <w:b/>
-                    <w:spacing w:val="-8"/>
-                    <w:sz w:val="16"/>
-                  </w:rPr>
-                  <w:t xml:space="preserve"> </w:t>
-                </w:r>
-                <w:r>
-                  <w:rPr>
-                    <w:rFonts w:ascii="Arial" w:hAnsi="Arial"/>
-                    <w:b/>
-                    <w:sz w:val="16"/>
-                  </w:rPr>
-                  <w:t>Курганская,</w:t>
-                </w:r>
-                <w:r>
-                  <w:rPr>
-                    <w:rFonts w:ascii="Arial" w:hAnsi="Arial"/>
-                    <w:b/>
-                    <w:spacing w:val="-8"/>
-                    <w:sz w:val="16"/>
-                  </w:rPr>
-                  <w:t xml:space="preserve"> </w:t>
-                </w:r>
-                <w:r>
-                  <w:rPr>
-                    <w:rFonts w:ascii="Arial" w:hAnsi="Arial"/>
-                    <w:b/>
-                    <w:sz w:val="16"/>
-                  </w:rPr>
-                  <w:t>д.</w:t>
-                </w:r>
-                <w:r>
-                  <w:rPr>
-                    <w:rFonts w:ascii="Arial" w:hAnsi="Arial"/>
-                    <w:b/>
-                    <w:spacing w:val="-8"/>
-                    <w:sz w:val="16"/>
-                  </w:rPr>
-                  <w:t xml:space="preserve"> </w:t>
-                </w:r>
-                <w:r>
-                  <w:rPr>
-                    <w:rFonts w:ascii="Arial" w:hAnsi="Arial"/>
-                    <w:b/>
-                    <w:sz w:val="16"/>
-                  </w:rPr>
-                  <w:t>3а,</w:t>
-                </w:r>
-                <w:r>
-                  <w:rPr>
-                    <w:rFonts w:ascii="Arial" w:hAnsi="Arial"/>
-                    <w:b/>
-                    <w:spacing w:val="-8"/>
-                    <w:sz w:val="16"/>
-                  </w:rPr>
-                  <w:t xml:space="preserve"> </w:t>
-                </w:r>
-                <w:r>
-                  <w:rPr>
-                    <w:rFonts w:ascii="Arial" w:hAnsi="Arial"/>
-                    <w:b/>
-                    <w:sz w:val="16"/>
-                  </w:rPr>
-                  <w:t xml:space="preserve">с.1 </w:t>
-                </w:r>
-                <w:r>
-                  <w:rPr>
-                    <w:rFonts w:ascii="Arial" w:hAnsi="Arial"/>
-                    <w:b/>
-                    <w:spacing w:val="-2"/>
-                    <w:sz w:val="16"/>
-                  </w:rPr>
-                  <w:t>https://</w:t>
-                </w:r>
-                <w:hyperlink r:id="rId3">
-                  <w:r>
-                    <w:rPr>
-                      <w:rFonts w:ascii="Arial" w:hAnsi="Arial"/>
-                      <w:b/>
-                      <w:spacing w:val="-2"/>
-                      <w:sz w:val="16"/>
-                    </w:rPr>
-                    <w:t>www.verkup.ru</w:t>
-                  </w:r>
-                </w:hyperlink>
-              </w:p>
-            </w:txbxContent>
-          </v:textbox>
-          <w10:wrap anchorx="page" anchory="page"/>
-        </v:shape>
-      </w:pict>
+      <w:rPr>
+        <w:noProof/>
+      </w:rPr>
+      <mc:AlternateContent>
+        <mc:Choice Requires="wps">
+          <w:drawing>
+            <wp:anchor distT="0" distB="0" distL="114300" distR="114300" simplePos="0" relativeHeight="487364096" behindDoc="1" locked="0" layoutInCell="1" allowOverlap="1" wp14:anchorId="38B6A32C" wp14:editId="13B2243D">
+              <wp:simplePos x="0" y="0"/>
+              <wp:positionH relativeFrom="page">
+                <wp:posOffset>4658995</wp:posOffset>
+              </wp:positionH>
+              <wp:positionV relativeFrom="page">
+                <wp:posOffset>277495</wp:posOffset>
+              </wp:positionV>
+              <wp:extent cx="1684020" cy="254000"/>
+              <wp:effectExtent l="0" t="0" r="0" b="0"/>
+              <wp:wrapNone/>
+              <wp:docPr id="2" name="docshape2"/>
+              <wp:cNvGraphicFramePr>
+                <a:graphicFrameLocks xmlns:a="http://schemas.openxmlformats.org/drawingml/2006/main"/>
+              </wp:cNvGraphicFramePr>
+              <a:graphic xmlns:a="http://schemas.openxmlformats.org/drawingml/2006/main">
+                <a:graphicData uri="http://schemas.microsoft.com/office/word/2010/wordprocessingShape">
+                  <wps:wsp>
+                    <wps:cNvSpPr txBox="1">
+                      <a:spLocks noChangeArrowheads="1"/>
+                    </wps:cNvSpPr>
+                    <wps:spPr bwMode="auto">
+                      <a:xfrm>
+                        <a:off x="0" y="0"/>
+                        <a:ext cx="1684020" cy="254000"/>
+                      </a:xfrm>
+                      <a:prstGeom prst="rect">
+                        <a:avLst/>
+                      </a:prstGeom>
+                      <a:noFill/>
+                      <a:ln>
+                        <a:noFill/>
+                      </a:ln>
+                      <a:extLst>
+                        <a:ext uri="{909E8E84-426E-40DD-AFC4-6F175D3DCCD1}">
+                          <a14:hiddenFill xmlns:a14="http://schemas.microsoft.com/office/drawing/2010/main">
+                            <a:solidFill>
+                              <a:srgbClr val="FFFFFF"/>
+                            </a:solidFill>
+                          </a14:hiddenFill>
+                        </a:ext>
+                        <a:ext uri="{91240B29-F687-4F45-9708-019B960494DF}">
+                          <a14:hiddenLine xmlns:a14="http://schemas.microsoft.com/office/drawing/2010/main" w="9525">
+                            <a:solidFill>
+                              <a:srgbClr val="000000"/>
+                            </a:solidFill>
+                            <a:miter lim="800000"/>
+                            <a:headEnd/>
+                            <a:tailEnd/>
+                          </a14:hiddenLine>
+                        </a:ext>
+                      </a:extLst>
+                    </wps:spPr>
+                    <wps:txbx>
+                      <w:txbxContent>
+                        <w:p>
+                          <w:pPr>
+                            <w:spacing w:before="13"/>
+                            <w:ind w:left="486" w:hanging="467"/>
+                            <w:rPr>
+                              <w:rFonts w:ascii="Arial" w:hAnsi="Arial"/>
+                              <w:b/>
+                              <w:sz w:val="16"/>
+                            </w:rPr>
+                          </w:pPr>
+                          <w:r>
+                            <w:rPr>
+                              <w:rFonts w:ascii="Arial" w:hAnsi="Arial"/>
+                              <w:b/>
+                              <w:sz w:val="16"/>
+                            </w:rPr>
+                            <w:t>Москва,</w:t>
+                          </w:r>
+                          <w:r>
+                            <w:rPr>
+                              <w:rFonts w:ascii="Arial" w:hAnsi="Arial"/>
+                              <w:b/>
+                              <w:spacing w:val="-8"/>
+                              <w:sz w:val="16"/>
+                            </w:rPr>
+                            <w:t xml:space="preserve"> </w:t>
+                          </w:r>
+                          <w:r>
+                            <w:rPr>
+                              <w:rFonts w:ascii="Arial" w:hAnsi="Arial"/>
+                              <w:b/>
+                              <w:sz w:val="16"/>
+                            </w:rPr>
+                            <w:t>ул.</w:t>
+                          </w:r>
+                          <w:r>
+                            <w:rPr>
+                              <w:rFonts w:ascii="Arial" w:hAnsi="Arial"/>
+                              <w:b/>
+                              <w:spacing w:val="-8"/>
+                              <w:sz w:val="16"/>
+                            </w:rPr>
+                            <w:t xml:space="preserve"> </w:t>
+                          </w:r>
+                          <w:r>
+                            <w:rPr>
+                              <w:rFonts w:ascii="Arial" w:hAnsi="Arial"/>
+                              <w:b/>
+                              <w:sz w:val="16"/>
+                            </w:rPr>
+                            <w:t>Курганская,</w:t>
+                          </w:r>
+                          <w:r>
+                            <w:rPr>
+                              <w:rFonts w:ascii="Arial" w:hAnsi="Arial"/>
+                              <w:b/>
+                              <w:spacing w:val="-8"/>
+                              <w:sz w:val="16"/>
+                            </w:rPr>
+                            <w:t xml:space="preserve"> </w:t>
+                          </w:r>
+                          <w:r>
+                            <w:rPr>
+                              <w:rFonts w:ascii="Arial" w:hAnsi="Arial"/>
+                              <w:b/>
+                              <w:sz w:val="16"/>
+                            </w:rPr>
+                            <w:t>д.</w:t>
+                          </w:r>
+                          <w:r>
+                            <w:rPr>
+                              <w:rFonts w:ascii="Arial" w:hAnsi="Arial"/>
+                              <w:b/>
+                              <w:spacing w:val="-8"/>
+                              <w:sz w:val="16"/>
+                            </w:rPr>
+                            <w:t xml:space="preserve"> </w:t>
+                          </w:r>
+                          <w:r>
+                            <w:rPr>
+                              <w:rFonts w:ascii="Arial" w:hAnsi="Arial"/>
+                              <w:b/>
+                              <w:sz w:val="16"/>
+                            </w:rPr>
+                            <w:t>3а,</w:t>
+                          </w:r>
+                          <w:r>
+                            <w:rPr>
+                              <w:rFonts w:ascii="Arial" w:hAnsi="Arial"/>
+                              <w:b/>
+                              <w:spacing w:val="-8"/>
+                              <w:sz w:val="16"/>
+                            </w:rPr>
+                            <w:t xml:space="preserve"> </w:t>
+                          </w:r>
+                          <w:r>
+                            <w:rPr>
+                              <w:rFonts w:ascii="Arial" w:hAnsi="Arial"/>
+                              <w:b/>
+                              <w:sz w:val="16"/>
+                            </w:rPr>
+                            <w:t xml:space="preserve">с.1 </w:t>
+                          </w:r>
+                          <w:r>
+                            <w:rPr>
+                              <w:rFonts w:ascii="Arial" w:hAnsi="Arial"/>
+                              <w:b/>
+                              <w:spacing w:val="-2"/>
+                              <w:sz w:val="16"/>
+                            </w:rPr>
+                            <w:t>https://</w:t>
+                          </w:r>
+                          <w:hyperlink r:id="rId4">
+                            <w:r>
+                              <w:rPr>
+                                <w:rFonts w:ascii="Arial" w:hAnsi="Arial"/>
+                                <w:b/>
+                                <w:spacing w:val="-2"/>
+                                <w:sz w:val="16"/>
+                              </w:rPr>
+                              <w:t>www.verkup.ru</w:t>
+                            </w:r>
+                          </w:hyperlink>
+                        </w:p>
+                      </w:txbxContent>
+                    </wps:txbx>
+                    <wps:bodyPr rot="0" vert="horz" wrap="square" lIns="0" tIns="0" rIns="0" bIns="0" anchor="t" anchorCtr="0" upright="1">
+                      <a:noAutofit/>
+                    </wps:bodyPr>
+                  </wps:wsp>
+                </a:graphicData>
+              </a:graphic>
+              <wp14:sizeRelH relativeFrom="page">
+                <wp14:pctWidth>0</wp14:pctWidth>
+              </wp14:sizeRelH>
+              <wp14:sizeRelV relativeFrom="page">
+                <wp14:pctHeight>0</wp14:pctHeight>
+              </wp14:sizeRelV>
+            </wp:anchor>
+          </w:drawing>
+        </mc:Choice>
+        <mc:Fallback>
+          <w:pict>
+            <v:shape w14:anchorId="38B6A32C" id="docshape2" o:spid="_x0000_s1027" type="#_x0000_t202" style="position:absolute;margin-left:366.85pt;margin-top:21.85pt;width:132.6pt;height:20pt;z-index:-15952384;visibility:visible;mso-wrap-style:square;mso-width-percent:0;mso-height-percent:0;mso-wrap-distance-left:9pt;mso-wrap-distance-top:0;mso-wrap-distance-right:9pt;mso-wrap-distance-bottom:0;mso-position-horizontal:absolute;mso-position-horizontal-relative:page;mso-position-vertical:absolute;mso-position-vertical-relative:page;mso-width-percent:0;mso-height-percent:0;mso-width-relative:page;mso-height-relative:page;v-text-anchor:top" o:gfxdata="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" filled="f" stroked="f">
+              <v:textbox inset="0,0,0,0">
+                <w:txbxContent>
+                  <w:p>
+                    <w:pPr>
+                      <w:spacing w:before="13"/>
+                      <w:ind w:left="486" w:hanging="467"/>
+                      <w:rPr>
+                        <w:rFonts w:ascii="Arial" w:hAnsi="Arial"/>
+                        <w:b/>
+                        <w:sz w:val="16"/>
+                      </w:rPr>
+                    </w:pPr>
+                    <w:r>
+                      <w:rPr>
+                        <w:rFonts w:ascii="Arial" w:hAnsi="Arial"/>
+                        <w:b/>
+                        <w:sz w:val="16"/>
+                      </w:rPr>
+                      <w:t>Москва,</w:t>
+                    </w:r>
+                    <w:r>
+                      <w:rPr>
+                        <w:rFonts w:ascii="Arial" w:hAnsi="Arial"/>
+                        <w:b/>
+                        <w:spacing w:val="-8"/>
+                        <w:sz w:val="16"/>
+                      </w:rPr>
+                      <w:t xml:space="preserve"> </w:t>
+                    </w:r>
+                    <w:r>
+                      <w:rPr>
+                        <w:rFonts w:ascii="Arial" w:hAnsi="Arial"/>
+                        <w:b/>
+                        <w:sz w:val="16"/>
+                      </w:rPr>
+                      <w:t>ул.</w:t>
+                    </w:r>
+                    <w:r>
+                      <w:rPr>
+                        <w:rFonts w:ascii="Arial" w:hAnsi="Arial"/>
+                        <w:b/>
+                        <w:spacing w:val="-8"/>
+                        <w:sz w:val="16"/>
+                      </w:rPr>
+                      <w:t xml:space="preserve"> </w:t>
+                    </w:r>
+                    <w:r>
+                      <w:rPr>
+                        <w:rFonts w:ascii="Arial" w:hAnsi="Arial"/>
+                        <w:b/>
+                        <w:sz w:val="16"/>
+                      </w:rPr>
+                      <w:t>Курганская,</w:t>
+                    </w:r>
+                    <w:r>
+                      <w:rPr>
+                        <w:rFonts w:ascii="Arial" w:hAnsi="Arial"/>
+                        <w:b/>
+                        <w:spacing w:val="-8"/>
+                        <w:sz w:val="16"/>
+                      </w:rPr>
+                      <w:t xml:space="preserve"> </w:t>
+                    </w:r>
+                    <w:r>
+                      <w:rPr>
+                        <w:rFonts w:ascii="Arial" w:hAnsi="Arial"/>
+                        <w:b/>
+                        <w:sz w:val="16"/>
+                      </w:rPr>
+                      <w:t>д.</w:t>
+                    </w:r>
+                    <w:r>
+                      <w:rPr>
+                        <w:rFonts w:ascii="Arial" w:hAnsi="Arial"/>
+                        <w:b/>
+                        <w:spacing w:val="-8"/>
+                        <w:sz w:val="16"/>
+                      </w:rPr>
+                      <w:t xml:space="preserve"> </w:t>
+                    </w:r>
+                    <w:r>
+                      <w:rPr>
+                        <w:rFonts w:ascii="Arial" w:hAnsi="Arial"/>
+                        <w:b/>
+                        <w:sz w:val="16"/>
+                      </w:rPr>
+                      <w:t>3а,</w:t>
+                    </w:r>
+                    <w:r>
+                      <w:rPr>
+                        <w:rFonts w:ascii="Arial" w:hAnsi="Arial"/>
+                        <w:b/>
+                        <w:spacing w:val="-8"/>
+                        <w:sz w:val="16"/>
+                      </w:rPr>
+                      <w:t xml:space="preserve"> </w:t>
+                    </w:r>
+                    <w:r>
+                      <w:rPr>
+                        <w:rFonts w:ascii="Arial" w:hAnsi="Arial"/>
+                        <w:b/>
+                        <w:sz w:val="16"/>
+                      </w:rPr>
+                      <w:t xml:space="preserve">с.1 </w:t>
+                    </w:r>
+                    <w:r>
+                      <w:rPr>
+                        <w:rFonts w:ascii="Arial" w:hAnsi="Arial"/>
+                        <w:b/>
+                        <w:spacing w:val="-2"/>
+                        <w:sz w:val="16"/>
+                      </w:rPr>
+                      <w:t>https://</w:t>
+                    </w:r>
+                    <w:hyperlink r:id="rId5">
+                      <w:r>
+                        <w:rPr>
+                          <w:rFonts w:ascii="Arial" w:hAnsi="Arial"/>
+                          <w:b/>
+                          <w:spacing w:val="-2"/>
+                          <w:sz w:val="16"/>
+                        </w:rPr>
+                        <w:t>www.verkup.ru</w:t>
+                      </w:r>
+                    </w:hyperlink>
+                  </w:p>
+                </w:txbxContent>
+              </v:textbox>
+              <w10:wrap anchorx="page" anchory="page"/>
+            </v:shape>
+          </w:pict>
+        </mc:Fallback>
+      </mc:AlternateContent>
     </w:r>
   </w:p>
 </w:hdr>

</xml_diff>